<commit_message>
Add ESP32Servo library and implement servo control functionality
- Created library.properties for ESP32Servo with metadata.
- Implemented ESP32PWM class for PWM control, including timer allocation and frequency adjustment.
- Developed Servo class to manage servo motors, including methods for attaching, detaching, and writing angles.
- Added functionality to read and write servo angles in degrees and microseconds.
- Integrated servo initialization in the main application with initServos function.
- Enhanced command handling in the training module to control individual servo angles via Bluetooth commands.
</commit_message>
<xml_diff>
--- a/ESP32pins.docx
+++ b/ESP32pins.docx
@@ -869,61 +869,63 @@
       <w:tr>
         <w:trPr>
           <w:cnfStyle w:val="000000100000" w:firstRow="0" w:lastRow="0" w:firstColumn="0" w:lastColumn="0" w:oddVBand="0" w:evenVBand="0" w:oddHBand="1" w:evenHBand="0" w:firstRowFirstColumn="0" w:firstRowLastColumn="0" w:lastRowFirstColumn="0" w:lastRowLastColumn="0"/>
-          <w:trHeight w:val="787"/>
+          <w:trHeight w:val="813"/>
           <w:jc w:val="center"/>
         </w:trPr>
         <w:tc>
           <w:tcPr>
             <w:cnfStyle w:val="001000000000" w:firstRow="0" w:lastRow="0" w:firstColumn="1" w:lastColumn="0" w:oddVBand="0" w:evenVBand="0" w:oddHBand="0" w:evenHBand="0" w:firstRowFirstColumn="0" w:firstRowLastColumn="0" w:lastRowFirstColumn="0" w:lastRowLastColumn="0"/>
             <w:tcW w:w="0" w:type="auto"/>
-            <w:hideMark/>
-          </w:tcPr>
-          <w:p>
-            <w:pPr>
-              <w:spacing w:before="240" w:line="360" w:lineRule="auto"/>
-              <w:jc w:val="center"/>
-            </w:pPr>
-            <w:r>
-              <w:t>DC Motor 1</w:t>
-            </w:r>
-          </w:p>
-        </w:tc>
-        <w:tc>
-          <w:tcPr>
-            <w:tcW w:w="0" w:type="auto"/>
-            <w:hideMark/>
-          </w:tcPr>
-          <w:p>
-            <w:pPr>
-              <w:spacing w:before="240" w:line="360" w:lineRule="auto"/>
-              <w:jc w:val="center"/>
-              <w:cnfStyle w:val="000000100000" w:firstRow="0" w:lastRow="0" w:firstColumn="0" w:lastColumn="0" w:oddVBand="0" w:evenVBand="0" w:oddHBand="1" w:evenHBand="0" w:firstRowFirstColumn="0" w:firstRowLastColumn="0" w:lastRowFirstColumn="0" w:lastRowLastColumn="0"/>
-            </w:pPr>
-            <w:r>
-              <w:t>Speed (PWM)</w:t>
-            </w:r>
-          </w:p>
-        </w:tc>
-        <w:tc>
-          <w:tcPr>
-            <w:tcW w:w="0" w:type="auto"/>
-            <w:hideMark/>
-          </w:tcPr>
-          <w:p>
-            <w:pPr>
-              <w:spacing w:before="240" w:line="360" w:lineRule="auto"/>
-              <w:jc w:val="center"/>
-              <w:cnfStyle w:val="000000100000" w:firstRow="0" w:lastRow="0" w:firstColumn="0" w:lastColumn="0" w:oddVBand="0" w:evenVBand="0" w:oddHBand="1" w:evenHBand="0" w:firstRowFirstColumn="0" w:firstRowLastColumn="0" w:lastRowFirstColumn="0" w:lastRowLastColumn="0"/>
-            </w:pPr>
-            <w:r>
-              <w:t>GPIO 33</w:t>
-            </w:r>
-          </w:p>
-        </w:tc>
-        <w:tc>
-          <w:tcPr>
-            <w:tcW w:w="0" w:type="auto"/>
-            <w:hideMark/>
+          </w:tcPr>
+          <w:p>
+            <w:pPr>
+              <w:spacing w:before="240" w:line="360" w:lineRule="auto"/>
+              <w:jc w:val="center"/>
+            </w:pPr>
+            <w:r>
+              <w:t xml:space="preserve">Servo </w:t>
+            </w:r>
+            <w:r>
+              <w:t>4</w:t>
+            </w:r>
+          </w:p>
+        </w:tc>
+        <w:tc>
+          <w:tcPr>
+            <w:tcW w:w="0" w:type="auto"/>
+          </w:tcPr>
+          <w:p>
+            <w:pPr>
+              <w:spacing w:before="240" w:line="360" w:lineRule="auto"/>
+              <w:jc w:val="center"/>
+              <w:cnfStyle w:val="000000100000" w:firstRow="0" w:lastRow="0" w:firstColumn="0" w:lastColumn="0" w:oddVBand="0" w:evenVBand="0" w:oddHBand="1" w:evenHBand="0" w:firstRowFirstColumn="0" w:firstRowLastColumn="0" w:lastRowFirstColumn="0" w:lastRowLastColumn="0"/>
+            </w:pPr>
+            <w:r>
+              <w:t>PWM Signal</w:t>
+            </w:r>
+          </w:p>
+        </w:tc>
+        <w:tc>
+          <w:tcPr>
+            <w:tcW w:w="0" w:type="auto"/>
+          </w:tcPr>
+          <w:p>
+            <w:pPr>
+              <w:spacing w:before="240" w:line="360" w:lineRule="auto"/>
+              <w:jc w:val="center"/>
+              <w:cnfStyle w:val="000000100000" w:firstRow="0" w:lastRow="0" w:firstColumn="0" w:lastColumn="0" w:oddVBand="0" w:evenVBand="0" w:oddHBand="1" w:evenHBand="0" w:firstRowFirstColumn="0" w:firstRowLastColumn="0" w:lastRowFirstColumn="0" w:lastRowLastColumn="0"/>
+            </w:pPr>
+            <w:r>
+              <w:t xml:space="preserve">GPIO </w:t>
+            </w:r>
+            <w:r>
+              <w:t>18</w:t>
+            </w:r>
+          </w:p>
+        </w:tc>
+        <w:tc>
+          <w:tcPr>
+            <w:tcW w:w="0" w:type="auto"/>
           </w:tcPr>
           <w:p>
             <w:pPr>
@@ -939,16 +941,15 @@
         <w:tc>
           <w:tcPr>
             <w:tcW w:w="5789" w:type="dxa"/>
-            <w:hideMark/>
-          </w:tcPr>
-          <w:p>
-            <w:pPr>
-              <w:spacing w:before="240" w:line="360" w:lineRule="auto"/>
-              <w:jc w:val="center"/>
-              <w:cnfStyle w:val="000000100000" w:firstRow="0" w:lastRow="0" w:firstColumn="0" w:lastColumn="0" w:oddVBand="0" w:evenVBand="0" w:oddHBand="1" w:evenHBand="0" w:firstRowFirstColumn="0" w:firstRowLastColumn="0" w:lastRowFirstColumn="0" w:lastRowLastColumn="0"/>
-            </w:pPr>
-            <w:r>
-              <w:t>Connect to Motor Driver Enable pin.</w:t>
+          </w:tcPr>
+          <w:p>
+            <w:pPr>
+              <w:spacing w:before="240" w:line="360" w:lineRule="auto"/>
+              <w:jc w:val="center"/>
+              <w:cnfStyle w:val="000000100000" w:firstRow="0" w:lastRow="0" w:firstColumn="0" w:lastColumn="0" w:oddVBand="0" w:evenVBand="0" w:oddHBand="1" w:evenHBand="0" w:firstRowFirstColumn="0" w:firstRowLastColumn="0" w:lastRowFirstColumn="0" w:lastRowLastColumn="0"/>
+            </w:pPr>
+            <w:r>
+              <w:t>Assign to ESP32 PWM Channel in code.</w:t>
             </w:r>
           </w:p>
         </w:tc>
@@ -962,79 +963,102 @@
           <w:tcPr>
             <w:cnfStyle w:val="001000000000" w:firstRow="0" w:lastRow="0" w:firstColumn="1" w:lastColumn="0" w:oddVBand="0" w:evenVBand="0" w:oddHBand="0" w:evenHBand="0" w:firstRowFirstColumn="0" w:firstRowLastColumn="0" w:lastRowFirstColumn="0" w:lastRowLastColumn="0"/>
             <w:tcW w:w="0" w:type="auto"/>
-            <w:hideMark/>
-          </w:tcPr>
-          <w:p>
-            <w:pPr>
-              <w:spacing w:before="240" w:line="360" w:lineRule="auto"/>
-              <w:jc w:val="center"/>
-            </w:pPr>
-            <w:r>
-              <w:t>DC Motor 1</w:t>
-            </w:r>
-          </w:p>
-        </w:tc>
-        <w:tc>
-          <w:tcPr>
-            <w:tcW w:w="0" w:type="auto"/>
-            <w:hideMark/>
-          </w:tcPr>
-          <w:p>
-            <w:pPr>
-              <w:spacing w:before="240" w:line="360" w:lineRule="auto"/>
-              <w:jc w:val="center"/>
-              <w:cnfStyle w:val="000000000000" w:firstRow="0" w:lastRow="0" w:firstColumn="0" w:lastColumn="0" w:oddVBand="0" w:evenVBand="0" w:oddHBand="0" w:evenHBand="0" w:firstRowFirstColumn="0" w:firstRowLastColumn="0" w:lastRowFirstColumn="0" w:lastRowLastColumn="0"/>
-            </w:pPr>
-            <w:r>
-              <w:t>Direction (DIR)</w:t>
-            </w:r>
-          </w:p>
-        </w:tc>
-        <w:tc>
-          <w:tcPr>
-            <w:tcW w:w="0" w:type="auto"/>
-            <w:hideMark/>
-          </w:tcPr>
-          <w:p>
-            <w:pPr>
-              <w:spacing w:before="240" w:line="360" w:lineRule="auto"/>
-              <w:jc w:val="center"/>
-              <w:cnfStyle w:val="000000000000" w:firstRow="0" w:lastRow="0" w:firstColumn="0" w:lastColumn="0" w:oddVBand="0" w:evenVBand="0" w:oddHBand="0" w:evenHBand="0" w:firstRowFirstColumn="0" w:firstRowLastColumn="0" w:lastRowFirstColumn="0" w:lastRowLastColumn="0"/>
-            </w:pPr>
-            <w:r>
-              <w:t>GPIO 19</w:t>
-            </w:r>
-          </w:p>
-        </w:tc>
-        <w:tc>
-          <w:tcPr>
-            <w:tcW w:w="0" w:type="auto"/>
-            <w:hideMark/>
-          </w:tcPr>
-          <w:p>
-            <w:pPr>
-              <w:spacing w:before="240" w:line="360" w:lineRule="auto"/>
-              <w:jc w:val="center"/>
-              <w:cnfStyle w:val="000000000000" w:firstRow="0" w:lastRow="0" w:firstColumn="0" w:lastColumn="0" w:oddVBand="0" w:evenVBand="0" w:oddHBand="0" w:evenHBand="0" w:firstRowFirstColumn="0" w:firstRowLastColumn="0" w:lastRowFirstColumn="0" w:lastRowLastColumn="0"/>
-            </w:pPr>
-            <w:r>
-              <w:t>Safe</w:t>
+          </w:tcPr>
+          <w:p>
+            <w:pPr>
+              <w:spacing w:before="240" w:line="360" w:lineRule="auto"/>
+              <w:jc w:val="center"/>
+            </w:pPr>
+            <w:r>
+              <w:t xml:space="preserve">Servo </w:t>
+            </w:r>
+            <w:r>
+              <w:t>5</w:t>
+            </w:r>
+          </w:p>
+        </w:tc>
+        <w:tc>
+          <w:tcPr>
+            <w:tcW w:w="0" w:type="auto"/>
+          </w:tcPr>
+          <w:p>
+            <w:pPr>
+              <w:spacing w:before="240" w:line="360" w:lineRule="auto"/>
+              <w:jc w:val="center"/>
+              <w:cnfStyle w:val="000000000000" w:firstRow="0" w:lastRow="0" w:firstColumn="0" w:lastColumn="0" w:oddVBand="0" w:evenVBand="0" w:oddHBand="0" w:evenHBand="0" w:firstRowFirstColumn="0" w:firstRowLastColumn="0" w:lastRowFirstColumn="0" w:lastRowLastColumn="0"/>
+            </w:pPr>
+            <w:r>
+              <w:t>PWM Signal</w:t>
+            </w:r>
+          </w:p>
+        </w:tc>
+        <w:tc>
+          <w:tcPr>
+            <w:tcW w:w="0" w:type="auto"/>
+          </w:tcPr>
+          <w:p>
+            <w:pPr>
+              <w:spacing w:before="240" w:line="360" w:lineRule="auto"/>
+              <w:jc w:val="center"/>
+              <w:cnfStyle w:val="000000000000" w:firstRow="0" w:lastRow="0" w:firstColumn="0" w:lastColumn="0" w:oddVBand="0" w:evenVBand="0" w:oddHBand="0" w:evenHBand="0" w:firstRowFirstColumn="0" w:firstRowLastColumn="0" w:lastRowFirstColumn="0" w:lastRowLastColumn="0"/>
+            </w:pPr>
+            <w:r>
+              <w:rPr>
+                <w:b/>
+                <w:bCs/>
+              </w:rPr>
+              <w:t>GPIO 2</w:t>
+            </w:r>
+          </w:p>
+        </w:tc>
+        <w:tc>
+          <w:tcPr>
+            <w:tcW w:w="0" w:type="auto"/>
+          </w:tcPr>
+          <w:p>
+            <w:pPr>
+              <w:spacing w:before="240" w:line="360" w:lineRule="auto"/>
+              <w:jc w:val="center"/>
+              <w:cnfStyle w:val="000000000000" w:firstRow="0" w:lastRow="0" w:firstColumn="0" w:lastColumn="0" w:oddVBand="0" w:evenVBand="0" w:oddHBand="0" w:evenHBand="0" w:firstRowFirstColumn="0" w:firstRowLastColumn="0" w:lastRowFirstColumn="0" w:lastRowLastColumn="0"/>
+            </w:pPr>
+            <w:r>
+              <w:rPr>
+                <w:b/>
+                <w:bCs/>
+              </w:rPr>
+              <w:t>Strapping</w:t>
             </w:r>
           </w:p>
         </w:tc>
         <w:tc>
           <w:tcPr>
             <w:tcW w:w="5789" w:type="dxa"/>
-            <w:hideMark/>
-          </w:tcPr>
-          <w:p>
-            <w:pPr>
-              <w:spacing w:before="240" w:line="360" w:lineRule="auto"/>
-              <w:jc w:val="center"/>
-              <w:cnfStyle w:val="000000000000" w:firstRow="0" w:lastRow="0" w:firstColumn="0" w:lastColumn="0" w:oddVBand="0" w:evenVBand="0" w:oddHBand="0" w:evenHBand="0" w:firstRowFirstColumn="0" w:firstRowLastColumn="0" w:lastRowFirstColumn="0" w:lastRowLastColumn="0"/>
-            </w:pPr>
-            <w:r>
-              <w:t>Connect to IN1 (and NOT gate to IN2).</w:t>
+          </w:tcPr>
+          <w:p>
+            <w:pPr>
+              <w:spacing w:before="240" w:line="360" w:lineRule="auto"/>
+              <w:jc w:val="center"/>
+              <w:cnfStyle w:val="000000000000" w:firstRow="0" w:lastRow="0" w:firstColumn="0" w:lastColumn="0" w:oddVBand="0" w:evenVBand="0" w:oddHBand="0" w:evenHBand="0" w:firstRowFirstColumn="0" w:firstRowLastColumn="0" w:lastRowFirstColumn="0" w:lastRowLastColumn="0"/>
+              <w:rPr>
+                <w:b/>
+                <w:bCs/>
+              </w:rPr>
+            </w:pPr>
+            <w:r>
+              <w:rPr>
+                <w:rFonts w:ascii="Segoe UI Emoji" w:hAnsi="Segoe UI Emoji" w:cs="Segoe UI Emoji"/>
+              </w:rPr>
+              <w:t>⚠️</w:t>
+            </w:r>
+            <w:r>
+              <w:t xml:space="preserve"> </w:t>
+            </w:r>
+            <w:r>
+              <w:rPr>
+                <w:b/>
+                <w:bCs/>
+              </w:rPr>
+              <w:t>Must add a 10kΩ Pull-Down resistor to GND.</w:t>
             </w:r>
           </w:p>
         </w:tc>
@@ -1057,6 +1081,179 @@
               <w:jc w:val="center"/>
             </w:pPr>
             <w:r>
+              <w:t>DC Motor 1</w:t>
+            </w:r>
+          </w:p>
+        </w:tc>
+        <w:tc>
+          <w:tcPr>
+            <w:tcW w:w="0" w:type="auto"/>
+            <w:hideMark/>
+          </w:tcPr>
+          <w:p>
+            <w:pPr>
+              <w:spacing w:before="240" w:line="360" w:lineRule="auto"/>
+              <w:jc w:val="center"/>
+              <w:cnfStyle w:val="000000100000" w:firstRow="0" w:lastRow="0" w:firstColumn="0" w:lastColumn="0" w:oddVBand="0" w:evenVBand="0" w:oddHBand="1" w:evenHBand="0" w:firstRowFirstColumn="0" w:firstRowLastColumn="0" w:lastRowFirstColumn="0" w:lastRowLastColumn="0"/>
+            </w:pPr>
+            <w:r>
+              <w:t>Speed (PWM)</w:t>
+            </w:r>
+          </w:p>
+        </w:tc>
+        <w:tc>
+          <w:tcPr>
+            <w:tcW w:w="0" w:type="auto"/>
+            <w:hideMark/>
+          </w:tcPr>
+          <w:p>
+            <w:pPr>
+              <w:spacing w:before="240" w:line="360" w:lineRule="auto"/>
+              <w:jc w:val="center"/>
+              <w:cnfStyle w:val="000000100000" w:firstRow="0" w:lastRow="0" w:firstColumn="0" w:lastColumn="0" w:oddVBand="0" w:evenVBand="0" w:oddHBand="1" w:evenHBand="0" w:firstRowFirstColumn="0" w:firstRowLastColumn="0" w:lastRowFirstColumn="0" w:lastRowLastColumn="0"/>
+            </w:pPr>
+            <w:r>
+              <w:t>GPIO 33</w:t>
+            </w:r>
+          </w:p>
+        </w:tc>
+        <w:tc>
+          <w:tcPr>
+            <w:tcW w:w="0" w:type="auto"/>
+            <w:hideMark/>
+          </w:tcPr>
+          <w:p>
+            <w:pPr>
+              <w:spacing w:before="240" w:line="360" w:lineRule="auto"/>
+              <w:jc w:val="center"/>
+              <w:cnfStyle w:val="000000100000" w:firstRow="0" w:lastRow="0" w:firstColumn="0" w:lastColumn="0" w:oddVBand="0" w:evenVBand="0" w:oddHBand="1" w:evenHBand="0" w:firstRowFirstColumn="0" w:firstRowLastColumn="0" w:lastRowFirstColumn="0" w:lastRowLastColumn="0"/>
+            </w:pPr>
+            <w:r>
+              <w:t>Safe</w:t>
+            </w:r>
+          </w:p>
+        </w:tc>
+        <w:tc>
+          <w:tcPr>
+            <w:tcW w:w="5789" w:type="dxa"/>
+            <w:hideMark/>
+          </w:tcPr>
+          <w:p>
+            <w:pPr>
+              <w:spacing w:before="240" w:line="360" w:lineRule="auto"/>
+              <w:jc w:val="center"/>
+              <w:cnfStyle w:val="000000100000" w:firstRow="0" w:lastRow="0" w:firstColumn="0" w:lastColumn="0" w:oddVBand="0" w:evenVBand="0" w:oddHBand="1" w:evenHBand="0" w:firstRowFirstColumn="0" w:firstRowLastColumn="0" w:lastRowFirstColumn="0" w:lastRowLastColumn="0"/>
+            </w:pPr>
+            <w:r>
+              <w:t>Connect to Motor Driver Enable pin.</w:t>
+            </w:r>
+          </w:p>
+        </w:tc>
+      </w:tr>
+      <w:tr>
+        <w:trPr>
+          <w:trHeight w:val="813"/>
+          <w:jc w:val="center"/>
+        </w:trPr>
+        <w:tc>
+          <w:tcPr>
+            <w:cnfStyle w:val="001000000000" w:firstRow="0" w:lastRow="0" w:firstColumn="1" w:lastColumn="0" w:oddVBand="0" w:evenVBand="0" w:oddHBand="0" w:evenHBand="0" w:firstRowFirstColumn="0" w:firstRowLastColumn="0" w:lastRowFirstColumn="0" w:lastRowLastColumn="0"/>
+            <w:tcW w:w="0" w:type="auto"/>
+            <w:hideMark/>
+          </w:tcPr>
+          <w:p>
+            <w:pPr>
+              <w:spacing w:before="240" w:line="360" w:lineRule="auto"/>
+              <w:jc w:val="center"/>
+            </w:pPr>
+            <w:r>
+              <w:t>DC Motor 1</w:t>
+            </w:r>
+          </w:p>
+        </w:tc>
+        <w:tc>
+          <w:tcPr>
+            <w:tcW w:w="0" w:type="auto"/>
+            <w:hideMark/>
+          </w:tcPr>
+          <w:p>
+            <w:pPr>
+              <w:spacing w:before="240" w:line="360" w:lineRule="auto"/>
+              <w:jc w:val="center"/>
+              <w:cnfStyle w:val="000000000000" w:firstRow="0" w:lastRow="0" w:firstColumn="0" w:lastColumn="0" w:oddVBand="0" w:evenVBand="0" w:oddHBand="0" w:evenHBand="0" w:firstRowFirstColumn="0" w:firstRowLastColumn="0" w:lastRowFirstColumn="0" w:lastRowLastColumn="0"/>
+            </w:pPr>
+            <w:r>
+              <w:t>Direction (DIR)</w:t>
+            </w:r>
+          </w:p>
+        </w:tc>
+        <w:tc>
+          <w:tcPr>
+            <w:tcW w:w="0" w:type="auto"/>
+            <w:hideMark/>
+          </w:tcPr>
+          <w:p>
+            <w:pPr>
+              <w:spacing w:before="240" w:line="360" w:lineRule="auto"/>
+              <w:jc w:val="center"/>
+              <w:cnfStyle w:val="000000000000" w:firstRow="0" w:lastRow="0" w:firstColumn="0" w:lastColumn="0" w:oddVBand="0" w:evenVBand="0" w:oddHBand="0" w:evenHBand="0" w:firstRowFirstColumn="0" w:firstRowLastColumn="0" w:lastRowFirstColumn="0" w:lastRowLastColumn="0"/>
+            </w:pPr>
+            <w:r>
+              <w:t>GPIO 19</w:t>
+            </w:r>
+          </w:p>
+        </w:tc>
+        <w:tc>
+          <w:tcPr>
+            <w:tcW w:w="0" w:type="auto"/>
+            <w:hideMark/>
+          </w:tcPr>
+          <w:p>
+            <w:pPr>
+              <w:spacing w:before="240" w:line="360" w:lineRule="auto"/>
+              <w:jc w:val="center"/>
+              <w:cnfStyle w:val="000000000000" w:firstRow="0" w:lastRow="0" w:firstColumn="0" w:lastColumn="0" w:oddVBand="0" w:evenVBand="0" w:oddHBand="0" w:evenHBand="0" w:firstRowFirstColumn="0" w:firstRowLastColumn="0" w:lastRowFirstColumn="0" w:lastRowLastColumn="0"/>
+            </w:pPr>
+            <w:r>
+              <w:t>Safe</w:t>
+            </w:r>
+          </w:p>
+        </w:tc>
+        <w:tc>
+          <w:tcPr>
+            <w:tcW w:w="5789" w:type="dxa"/>
+            <w:hideMark/>
+          </w:tcPr>
+          <w:p>
+            <w:pPr>
+              <w:spacing w:before="240" w:line="360" w:lineRule="auto"/>
+              <w:jc w:val="center"/>
+              <w:cnfStyle w:val="000000000000" w:firstRow="0" w:lastRow="0" w:firstColumn="0" w:lastColumn="0" w:oddVBand="0" w:evenVBand="0" w:oddHBand="0" w:evenHBand="0" w:firstRowFirstColumn="0" w:firstRowLastColumn="0" w:lastRowFirstColumn="0" w:lastRowLastColumn="0"/>
+            </w:pPr>
+            <w:r>
+              <w:t>Connect to IN1 (and NOT gate to IN2).</w:t>
+            </w:r>
+          </w:p>
+        </w:tc>
+      </w:tr>
+      <w:tr>
+        <w:trPr>
+          <w:cnfStyle w:val="000000100000" w:firstRow="0" w:lastRow="0" w:firstColumn="0" w:lastColumn="0" w:oddVBand="0" w:evenVBand="0" w:oddHBand="1" w:evenHBand="0" w:firstRowFirstColumn="0" w:firstRowLastColumn="0" w:lastRowFirstColumn="0" w:lastRowLastColumn="0"/>
+          <w:trHeight w:val="787"/>
+          <w:jc w:val="center"/>
+        </w:trPr>
+        <w:tc>
+          <w:tcPr>
+            <w:cnfStyle w:val="001000000000" w:firstRow="0" w:lastRow="0" w:firstColumn="1" w:lastColumn="0" w:oddVBand="0" w:evenVBand="0" w:oddHBand="0" w:evenHBand="0" w:firstRowFirstColumn="0" w:firstRowLastColumn="0" w:lastRowFirstColumn="0" w:lastRowLastColumn="0"/>
+            <w:tcW w:w="0" w:type="auto"/>
+            <w:hideMark/>
+          </w:tcPr>
+          <w:p>
+            <w:pPr>
+              <w:spacing w:before="240" w:line="360" w:lineRule="auto"/>
+              <w:jc w:val="center"/>
+            </w:pPr>
+            <w:r>
               <w:t>DC Motor 2</w:t>
             </w:r>
           </w:p>
@@ -1597,211 +1794,6 @@
               </w:rPr>
               <w:t>Must add a 10kΩ Pull-Up resistor to 3.3V.</w:t>
             </w:r>
-          </w:p>
-        </w:tc>
-      </w:tr>
-      <w:tr>
-        <w:trPr>
-          <w:cnfStyle w:val="000000100000" w:firstRow="0" w:lastRow="0" w:firstColumn="0" w:lastColumn="0" w:oddVBand="0" w:evenVBand="0" w:oddHBand="1" w:evenHBand="0" w:firstRowFirstColumn="0" w:firstRowLastColumn="0" w:lastRowFirstColumn="0" w:lastRowLastColumn="0"/>
-          <w:trHeight w:val="791"/>
-          <w:jc w:val="center"/>
-        </w:trPr>
-        <w:tc>
-          <w:tcPr>
-            <w:cnfStyle w:val="001000000000" w:firstRow="0" w:lastRow="0" w:firstColumn="1" w:lastColumn="0" w:oddVBand="0" w:evenVBand="0" w:oddHBand="0" w:evenHBand="0" w:firstRowFirstColumn="0" w:firstRowLastColumn="0" w:lastRowFirstColumn="0" w:lastRowLastColumn="0"/>
-            <w:tcW w:w="0" w:type="auto"/>
-            <w:hideMark/>
-          </w:tcPr>
-          <w:p>
-            <w:pPr>
-              <w:spacing w:before="240" w:line="360" w:lineRule="auto"/>
-              <w:jc w:val="center"/>
-            </w:pPr>
-            <w:r>
-              <w:t>DC Motor 5</w:t>
-            </w:r>
-          </w:p>
-        </w:tc>
-        <w:tc>
-          <w:tcPr>
-            <w:tcW w:w="0" w:type="auto"/>
-            <w:hideMark/>
-          </w:tcPr>
-          <w:p>
-            <w:pPr>
-              <w:spacing w:before="240" w:line="360" w:lineRule="auto"/>
-              <w:jc w:val="center"/>
-              <w:cnfStyle w:val="000000100000" w:firstRow="0" w:lastRow="0" w:firstColumn="0" w:lastColumn="0" w:oddVBand="0" w:evenVBand="0" w:oddHBand="1" w:evenHBand="0" w:firstRowFirstColumn="0" w:firstRowLastColumn="0" w:lastRowFirstColumn="0" w:lastRowLastColumn="0"/>
-            </w:pPr>
-            <w:r>
-              <w:t>Speed (PWM)</w:t>
-            </w:r>
-          </w:p>
-        </w:tc>
-        <w:tc>
-          <w:tcPr>
-            <w:tcW w:w="0" w:type="auto"/>
-            <w:hideMark/>
-          </w:tcPr>
-          <w:p>
-            <w:pPr>
-              <w:spacing w:before="240" w:line="360" w:lineRule="auto"/>
-              <w:jc w:val="center"/>
-              <w:cnfStyle w:val="000000100000" w:firstRow="0" w:lastRow="0" w:firstColumn="0" w:lastColumn="0" w:oddVBand="0" w:evenVBand="0" w:oddHBand="1" w:evenHBand="0" w:firstRowFirstColumn="0" w:firstRowLastColumn="0" w:lastRowFirstColumn="0" w:lastRowLastColumn="0"/>
-            </w:pPr>
-            <w:r>
-              <w:t>GPIO 18</w:t>
-            </w:r>
-          </w:p>
-        </w:tc>
-        <w:tc>
-          <w:tcPr>
-            <w:tcW w:w="0" w:type="auto"/>
-            <w:hideMark/>
-          </w:tcPr>
-          <w:p>
-            <w:pPr>
-              <w:spacing w:before="240" w:line="360" w:lineRule="auto"/>
-              <w:jc w:val="center"/>
-              <w:cnfStyle w:val="000000100000" w:firstRow="0" w:lastRow="0" w:firstColumn="0" w:lastColumn="0" w:oddVBand="0" w:evenVBand="0" w:oddHBand="1" w:evenHBand="0" w:firstRowFirstColumn="0" w:firstRowLastColumn="0" w:lastRowFirstColumn="0" w:lastRowLastColumn="0"/>
-            </w:pPr>
-            <w:r>
-              <w:t>Safe</w:t>
-            </w:r>
-          </w:p>
-        </w:tc>
-        <w:tc>
-          <w:tcPr>
-            <w:tcW w:w="5789" w:type="dxa"/>
-            <w:hideMark/>
-          </w:tcPr>
-          <w:p>
-            <w:pPr>
-              <w:spacing w:before="240" w:line="360" w:lineRule="auto"/>
-              <w:jc w:val="center"/>
-              <w:cnfStyle w:val="000000100000" w:firstRow="0" w:lastRow="0" w:firstColumn="0" w:lastColumn="0" w:oddVBand="0" w:evenVBand="0" w:oddHBand="1" w:evenHBand="0" w:firstRowFirstColumn="0" w:firstRowLastColumn="0" w:lastRowFirstColumn="0" w:lastRowLastColumn="0"/>
-            </w:pPr>
-            <w:r>
-              <w:t>Connect to Motor Driver Enable pin.</w:t>
-            </w:r>
-          </w:p>
-        </w:tc>
-      </w:tr>
-      <w:tr>
-        <w:trPr>
-          <w:trHeight w:val="1079"/>
-          <w:jc w:val="center"/>
-        </w:trPr>
-        <w:tc>
-          <w:tcPr>
-            <w:cnfStyle w:val="001000000000" w:firstRow="0" w:lastRow="0" w:firstColumn="1" w:lastColumn="0" w:oddVBand="0" w:evenVBand="0" w:oddHBand="0" w:evenHBand="0" w:firstRowFirstColumn="0" w:firstRowLastColumn="0" w:lastRowFirstColumn="0" w:lastRowLastColumn="0"/>
-            <w:tcW w:w="0" w:type="auto"/>
-            <w:hideMark/>
-          </w:tcPr>
-          <w:p>
-            <w:pPr>
-              <w:spacing w:before="240" w:line="360" w:lineRule="auto"/>
-              <w:jc w:val="center"/>
-            </w:pPr>
-            <w:r>
-              <w:t>DC Motor 5</w:t>
-            </w:r>
-          </w:p>
-        </w:tc>
-        <w:tc>
-          <w:tcPr>
-            <w:tcW w:w="0" w:type="auto"/>
-            <w:hideMark/>
-          </w:tcPr>
-          <w:p>
-            <w:pPr>
-              <w:spacing w:before="240" w:line="360" w:lineRule="auto"/>
-              <w:jc w:val="center"/>
-              <w:cnfStyle w:val="000000000000" w:firstRow="0" w:lastRow="0" w:firstColumn="0" w:lastColumn="0" w:oddVBand="0" w:evenVBand="0" w:oddHBand="0" w:evenHBand="0" w:firstRowFirstColumn="0" w:firstRowLastColumn="0" w:lastRowFirstColumn="0" w:lastRowLastColumn="0"/>
-            </w:pPr>
-            <w:r>
-              <w:t>Direction (DIR)</w:t>
-            </w:r>
-          </w:p>
-        </w:tc>
-        <w:tc>
-          <w:tcPr>
-            <w:tcW w:w="0" w:type="auto"/>
-            <w:hideMark/>
-          </w:tcPr>
-          <w:p>
-            <w:pPr>
-              <w:spacing w:before="240" w:line="360" w:lineRule="auto"/>
-              <w:jc w:val="center"/>
-              <w:cnfStyle w:val="000000000000" w:firstRow="0" w:lastRow="0" w:firstColumn="0" w:lastColumn="0" w:oddVBand="0" w:evenVBand="0" w:oddHBand="0" w:evenHBand="0" w:firstRowFirstColumn="0" w:firstRowLastColumn="0" w:lastRowFirstColumn="0" w:lastRowLastColumn="0"/>
-            </w:pPr>
-            <w:r>
-              <w:rPr>
-                <w:b/>
-                <w:bCs/>
-              </w:rPr>
-              <w:t>GPIO 2</w:t>
-            </w:r>
-          </w:p>
-        </w:tc>
-        <w:tc>
-          <w:tcPr>
-            <w:tcW w:w="0" w:type="auto"/>
-            <w:hideMark/>
-          </w:tcPr>
-          <w:p>
-            <w:pPr>
-              <w:spacing w:before="240" w:line="360" w:lineRule="auto"/>
-              <w:jc w:val="center"/>
-              <w:cnfStyle w:val="000000000000" w:firstRow="0" w:lastRow="0" w:firstColumn="0" w:lastColumn="0" w:oddVBand="0" w:evenVBand="0" w:oddHBand="0" w:evenHBand="0" w:firstRowFirstColumn="0" w:firstRowLastColumn="0" w:lastRowFirstColumn="0" w:lastRowLastColumn="0"/>
-            </w:pPr>
-            <w:r>
-              <w:rPr>
-                <w:b/>
-                <w:bCs/>
-              </w:rPr>
-              <w:t>Strapping</w:t>
-            </w:r>
-          </w:p>
-        </w:tc>
-        <w:tc>
-          <w:tcPr>
-            <w:tcW w:w="5789" w:type="dxa"/>
-            <w:hideMark/>
-          </w:tcPr>
-          <w:p>
-            <w:pPr>
-              <w:spacing w:before="240" w:line="360" w:lineRule="auto"/>
-              <w:jc w:val="center"/>
-              <w:cnfStyle w:val="000000000000" w:firstRow="0" w:lastRow="0" w:firstColumn="0" w:lastColumn="0" w:oddVBand="0" w:evenVBand="0" w:oddHBand="0" w:evenHBand="0" w:firstRowFirstColumn="0" w:firstRowLastColumn="0" w:lastRowFirstColumn="0" w:lastRowLastColumn="0"/>
-              <w:rPr>
-                <w:b/>
-                <w:bCs/>
-              </w:rPr>
-            </w:pPr>
-            <w:r>
-              <w:rPr>
-                <w:rFonts w:ascii="Segoe UI Emoji" w:hAnsi="Segoe UI Emoji" w:cs="Segoe UI Emoji"/>
-              </w:rPr>
-              <w:t>⚠️</w:t>
-            </w:r>
-            <w:r>
-              <w:t xml:space="preserve"> </w:t>
-            </w:r>
-            <w:r>
-              <w:rPr>
-                <w:b/>
-                <w:bCs/>
-              </w:rPr>
-              <w:t>Must add a 10kΩ Pull-Down resistor to GND.</w:t>
-            </w:r>
-          </w:p>
-          <w:p>
-            <w:pPr>
-              <w:spacing w:before="240" w:line="360" w:lineRule="auto"/>
-              <w:jc w:val="center"/>
-              <w:cnfStyle w:val="000000000000" w:firstRow="0" w:lastRow="0" w:firstColumn="0" w:lastColumn="0" w:oddVBand="0" w:evenVBand="0" w:oddHBand="0" w:evenHBand="0" w:firstRowFirstColumn="0" w:firstRowLastColumn="0" w:lastRowFirstColumn="0" w:lastRowLastColumn="0"/>
-            </w:pPr>
           </w:p>
         </w:tc>
       </w:tr>
@@ -2470,6 +2462,7 @@
   <w:style w:type="character" w:default="1" w:styleId="DefaultParagraphFont">
     <w:name w:val="Default Paragraph Font"/>
     <w:uiPriority w:val="1"/>
+    <w:semiHidden/>
     <w:unhideWhenUsed/>
   </w:style>
   <w:style w:type="table" w:default="1" w:styleId="TableNormal">

</xml_diff>

<commit_message>
Refactor motor control and servo management
- Moved motor control functions to a new motors.cpp and motors.h files for better organization.
- Added initialization and control functions for motors, including driveMecanum for mecanum wheel control.
- Removed old motorsTest.cpp file and replaced it with a new structure for testing motor functionality.
- Updated main program to integrate new motor control structure.
- Added servo control functionality for shoulder, elbow, gripper, and wrist servos in the main program.
- Introduced Bluetooth communication for remote control and servo angle adjustments.
- Cleaned up commented-out code in main.cpp for clarity.
</commit_message>
<xml_diff>
--- a/ESP32pins.docx
+++ b/ESP32pins.docx
@@ -335,6 +335,97 @@
       <w:tr>
         <w:trPr>
           <w:cnfStyle w:val="000000100000" w:firstRow="0" w:lastRow="0" w:firstColumn="0" w:lastColumn="0" w:oddVBand="0" w:evenVBand="0" w:oddHBand="1" w:evenHBand="0" w:firstRowFirstColumn="0" w:firstRowLastColumn="0" w:lastRowFirstColumn="0" w:lastRowLastColumn="0"/>
+          <w:trHeight w:val="787"/>
+          <w:jc w:val="center"/>
+        </w:trPr>
+        <w:tc>
+          <w:tcPr>
+            <w:cnfStyle w:val="001000000000" w:firstRow="0" w:lastRow="0" w:firstColumn="1" w:lastColumn="0" w:oddVBand="0" w:evenVBand="0" w:oddHBand="0" w:evenHBand="0" w:firstRowFirstColumn="0" w:firstRowLastColumn="0" w:lastRowFirstColumn="0" w:lastRowLastColumn="0"/>
+            <w:tcW w:w="0" w:type="auto"/>
+            <w:hideMark/>
+          </w:tcPr>
+          <w:p>
+            <w:pPr>
+              <w:spacing w:before="240" w:line="360" w:lineRule="auto"/>
+              <w:jc w:val="center"/>
+            </w:pPr>
+            <w:r>
+              <w:t xml:space="preserve">Front </w:t>
+            </w:r>
+            <w:proofErr w:type="spellStart"/>
+            <w:r>
+              <w:t>ToF</w:t>
+            </w:r>
+            <w:proofErr w:type="spellEnd"/>
+          </w:p>
+        </w:tc>
+        <w:tc>
+          <w:tcPr>
+            <w:tcW w:w="0" w:type="auto"/>
+            <w:hideMark/>
+          </w:tcPr>
+          <w:p>
+            <w:pPr>
+              <w:spacing w:before="240" w:line="360" w:lineRule="auto"/>
+              <w:jc w:val="center"/>
+              <w:cnfStyle w:val="000000100000" w:firstRow="0" w:lastRow="0" w:firstColumn="0" w:lastColumn="0" w:oddVBand="0" w:evenVBand="0" w:oddHBand="1" w:evenHBand="0" w:firstRowFirstColumn="0" w:firstRowLastColumn="0" w:lastRowFirstColumn="0" w:lastRowLastColumn="0"/>
+            </w:pPr>
+            <w:r>
+              <w:t>XSHUT</w:t>
+            </w:r>
+          </w:p>
+        </w:tc>
+        <w:tc>
+          <w:tcPr>
+            <w:tcW w:w="0" w:type="auto"/>
+            <w:hideMark/>
+          </w:tcPr>
+          <w:p>
+            <w:pPr>
+              <w:spacing w:before="240" w:line="360" w:lineRule="auto"/>
+              <w:jc w:val="center"/>
+              <w:cnfStyle w:val="000000100000" w:firstRow="0" w:lastRow="0" w:firstColumn="0" w:lastColumn="0" w:oddVBand="0" w:evenVBand="0" w:oddHBand="1" w:evenHBand="0" w:firstRowFirstColumn="0" w:firstRowLastColumn="0" w:lastRowFirstColumn="0" w:lastRowLastColumn="0"/>
+            </w:pPr>
+            <w:r>
+              <w:t>GPIO 14</w:t>
+            </w:r>
+          </w:p>
+        </w:tc>
+        <w:tc>
+          <w:tcPr>
+            <w:tcW w:w="0" w:type="auto"/>
+            <w:hideMark/>
+          </w:tcPr>
+          <w:p>
+            <w:pPr>
+              <w:spacing w:before="240" w:line="360" w:lineRule="auto"/>
+              <w:jc w:val="center"/>
+              <w:cnfStyle w:val="000000100000" w:firstRow="0" w:lastRow="0" w:firstColumn="0" w:lastColumn="0" w:oddVBand="0" w:evenVBand="0" w:oddHBand="1" w:evenHBand="0" w:firstRowFirstColumn="0" w:firstRowLastColumn="0" w:lastRowFirstColumn="0" w:lastRowLastColumn="0"/>
+            </w:pPr>
+            <w:r>
+              <w:t>Safe</w:t>
+            </w:r>
+          </w:p>
+        </w:tc>
+        <w:tc>
+          <w:tcPr>
+            <w:tcW w:w="5789" w:type="dxa"/>
+            <w:hideMark/>
+          </w:tcPr>
+          <w:p>
+            <w:pPr>
+              <w:spacing w:before="240" w:line="360" w:lineRule="auto"/>
+              <w:jc w:val="center"/>
+              <w:cnfStyle w:val="000000100000" w:firstRow="0" w:lastRow="0" w:firstColumn="0" w:lastColumn="0" w:oddVBand="0" w:evenVBand="0" w:oddHBand="1" w:evenHBand="0" w:firstRowFirstColumn="0" w:firstRowLastColumn="0" w:lastRowFirstColumn="0" w:lastRowLastColumn="0"/>
+            </w:pPr>
+            <w:r>
+              <w:t>Pull HIGH in code to activate.</w:t>
+            </w:r>
+          </w:p>
+        </w:tc>
+      </w:tr>
+      <w:tr>
+        <w:trPr>
           <w:trHeight w:val="813"/>
           <w:jc w:val="center"/>
         </w:trPr>
@@ -350,7 +441,7 @@
               <w:jc w:val="center"/>
             </w:pPr>
             <w:r>
-              <w:t xml:space="preserve">Left </w:t>
+              <w:t xml:space="preserve">Right </w:t>
             </w:r>
             <w:proofErr w:type="spellStart"/>
             <w:r>
@@ -368,7 +459,7 @@
             <w:pPr>
               <w:spacing w:before="240" w:line="360" w:lineRule="auto"/>
               <w:jc w:val="center"/>
-              <w:cnfStyle w:val="000000100000" w:firstRow="0" w:lastRow="0" w:firstColumn="0" w:lastColumn="0" w:oddVBand="0" w:evenVBand="0" w:oddHBand="1" w:evenHBand="0" w:firstRowFirstColumn="0" w:firstRowLastColumn="0" w:lastRowFirstColumn="0" w:lastRowLastColumn="0"/>
+              <w:cnfStyle w:val="000000000000" w:firstRow="0" w:lastRow="0" w:firstColumn="0" w:lastColumn="0" w:oddVBand="0" w:evenVBand="0" w:oddHBand="0" w:evenHBand="0" w:firstRowFirstColumn="0" w:firstRowLastColumn="0" w:lastRowFirstColumn="0" w:lastRowLastColumn="0"/>
             </w:pPr>
             <w:r>
               <w:t>XSHUT</w:t>
@@ -384,23 +475,23 @@
             <w:pPr>
               <w:spacing w:before="240" w:line="360" w:lineRule="auto"/>
               <w:jc w:val="center"/>
-              <w:cnfStyle w:val="000000100000" w:firstRow="0" w:lastRow="0" w:firstColumn="0" w:lastColumn="0" w:oddVBand="0" w:evenVBand="0" w:oddHBand="1" w:evenHBand="0" w:firstRowFirstColumn="0" w:firstRowLastColumn="0" w:lastRowFirstColumn="0" w:lastRowLastColumn="0"/>
-            </w:pPr>
-            <w:r>
-              <w:t>GPIO 13</w:t>
-            </w:r>
-          </w:p>
-        </w:tc>
-        <w:tc>
-          <w:tcPr>
-            <w:tcW w:w="0" w:type="auto"/>
-            <w:hideMark/>
-          </w:tcPr>
-          <w:p>
-            <w:pPr>
-              <w:spacing w:before="240" w:line="360" w:lineRule="auto"/>
-              <w:jc w:val="center"/>
-              <w:cnfStyle w:val="000000100000" w:firstRow="0" w:lastRow="0" w:firstColumn="0" w:lastColumn="0" w:oddVBand="0" w:evenVBand="0" w:oddHBand="1" w:evenHBand="0" w:firstRowFirstColumn="0" w:firstRowLastColumn="0" w:lastRowFirstColumn="0" w:lastRowLastColumn="0"/>
+              <w:cnfStyle w:val="000000000000" w:firstRow="0" w:lastRow="0" w:firstColumn="0" w:lastColumn="0" w:oddVBand="0" w:evenVBand="0" w:oddHBand="0" w:evenHBand="0" w:firstRowFirstColumn="0" w:firstRowLastColumn="0" w:lastRowFirstColumn="0" w:lastRowLastColumn="0"/>
+            </w:pPr>
+            <w:r>
+              <w:t>GPIO 27</w:t>
+            </w:r>
+          </w:p>
+        </w:tc>
+        <w:tc>
+          <w:tcPr>
+            <w:tcW w:w="0" w:type="auto"/>
+            <w:hideMark/>
+          </w:tcPr>
+          <w:p>
+            <w:pPr>
+              <w:spacing w:before="240" w:line="360" w:lineRule="auto"/>
+              <w:jc w:val="center"/>
+              <w:cnfStyle w:val="000000000000" w:firstRow="0" w:lastRow="0" w:firstColumn="0" w:lastColumn="0" w:oddVBand="0" w:evenVBand="0" w:oddHBand="0" w:evenHBand="0" w:firstRowFirstColumn="0" w:firstRowLastColumn="0" w:lastRowFirstColumn="0" w:lastRowLastColumn="0"/>
             </w:pPr>
             <w:r>
               <w:t>Safe</w:t>
@@ -416,10 +507,100 @@
             <w:pPr>
               <w:spacing w:before="240" w:line="360" w:lineRule="auto"/>
               <w:jc w:val="center"/>
-              <w:cnfStyle w:val="000000100000" w:firstRow="0" w:lastRow="0" w:firstColumn="0" w:lastColumn="0" w:oddVBand="0" w:evenVBand="0" w:oddHBand="1" w:evenHBand="0" w:firstRowFirstColumn="0" w:firstRowLastColumn="0" w:lastRowFirstColumn="0" w:lastRowLastColumn="0"/>
+              <w:cnfStyle w:val="000000000000" w:firstRow="0" w:lastRow="0" w:firstColumn="0" w:lastColumn="0" w:oddVBand="0" w:evenVBand="0" w:oddHBand="0" w:evenHBand="0" w:firstRowFirstColumn="0" w:firstRowLastColumn="0" w:lastRowFirstColumn="0" w:lastRowLastColumn="0"/>
             </w:pPr>
             <w:r>
               <w:t>Pull HIGH in code to activate.</w:t>
+            </w:r>
+          </w:p>
+        </w:tc>
+      </w:tr>
+      <w:tr>
+        <w:trPr>
+          <w:cnfStyle w:val="000000100000" w:firstRow="0" w:lastRow="0" w:firstColumn="0" w:lastColumn="0" w:oddVBand="0" w:evenVBand="0" w:oddHBand="1" w:evenHBand="0" w:firstRowFirstColumn="0" w:firstRowLastColumn="0" w:lastRowFirstColumn="0" w:lastRowLastColumn="0"/>
+          <w:trHeight w:val="787"/>
+          <w:jc w:val="center"/>
+        </w:trPr>
+        <w:tc>
+          <w:tcPr>
+            <w:cnfStyle w:val="001000000000" w:firstRow="0" w:lastRow="0" w:firstColumn="1" w:lastColumn="0" w:oddVBand="0" w:evenVBand="0" w:oddHBand="0" w:evenHBand="0" w:firstRowFirstColumn="0" w:firstRowLastColumn="0" w:lastRowFirstColumn="0" w:lastRowLastColumn="0"/>
+            <w:tcW w:w="0" w:type="auto"/>
+            <w:hideMark/>
+          </w:tcPr>
+          <w:p>
+            <w:pPr>
+              <w:spacing w:before="240" w:line="360" w:lineRule="auto"/>
+              <w:jc w:val="center"/>
+            </w:pPr>
+            <w:r>
+              <w:t>Servo 1</w:t>
+            </w:r>
+          </w:p>
+        </w:tc>
+        <w:tc>
+          <w:tcPr>
+            <w:tcW w:w="0" w:type="auto"/>
+            <w:hideMark/>
+          </w:tcPr>
+          <w:p>
+            <w:pPr>
+              <w:spacing w:before="240" w:line="360" w:lineRule="auto"/>
+              <w:jc w:val="center"/>
+              <w:cnfStyle w:val="000000100000" w:firstRow="0" w:lastRow="0" w:firstColumn="0" w:lastColumn="0" w:oddVBand="0" w:evenVBand="0" w:oddHBand="1" w:evenHBand="0" w:firstRowFirstColumn="0" w:firstRowLastColumn="0" w:lastRowFirstColumn="0" w:lastRowLastColumn="0"/>
+            </w:pPr>
+            <w:r>
+              <w:t>PWM Signal</w:t>
+            </w:r>
+          </w:p>
+        </w:tc>
+        <w:tc>
+          <w:tcPr>
+            <w:tcW w:w="0" w:type="auto"/>
+            <w:hideMark/>
+          </w:tcPr>
+          <w:p>
+            <w:pPr>
+              <w:spacing w:before="240" w:line="360" w:lineRule="auto"/>
+              <w:jc w:val="center"/>
+              <w:cnfStyle w:val="000000100000" w:firstRow="0" w:lastRow="0" w:firstColumn="0" w:lastColumn="0" w:oddVBand="0" w:evenVBand="0" w:oddHBand="1" w:evenHBand="0" w:firstRowFirstColumn="0" w:firstRowLastColumn="0" w:lastRowFirstColumn="0" w:lastRowLastColumn="0"/>
+            </w:pPr>
+            <w:r>
+              <w:t xml:space="preserve">GPIO </w:t>
+            </w:r>
+            <w:r>
+              <w:t>13</w:t>
+            </w:r>
+          </w:p>
+        </w:tc>
+        <w:tc>
+          <w:tcPr>
+            <w:tcW w:w="0" w:type="auto"/>
+            <w:hideMark/>
+          </w:tcPr>
+          <w:p>
+            <w:pPr>
+              <w:spacing w:before="240" w:line="360" w:lineRule="auto"/>
+              <w:jc w:val="center"/>
+              <w:cnfStyle w:val="000000100000" w:firstRow="0" w:lastRow="0" w:firstColumn="0" w:lastColumn="0" w:oddVBand="0" w:evenVBand="0" w:oddHBand="1" w:evenHBand="0" w:firstRowFirstColumn="0" w:firstRowLastColumn="0" w:lastRowFirstColumn="0" w:lastRowLastColumn="0"/>
+            </w:pPr>
+            <w:r>
+              <w:t>Safe</w:t>
+            </w:r>
+          </w:p>
+        </w:tc>
+        <w:tc>
+          <w:tcPr>
+            <w:tcW w:w="5789" w:type="dxa"/>
+            <w:hideMark/>
+          </w:tcPr>
+          <w:p>
+            <w:pPr>
+              <w:spacing w:before="240" w:line="360" w:lineRule="auto"/>
+              <w:jc w:val="center"/>
+              <w:cnfStyle w:val="000000100000" w:firstRow="0" w:lastRow="0" w:firstColumn="0" w:lastColumn="0" w:oddVBand="0" w:evenVBand="0" w:oddHBand="1" w:evenHBand="0" w:firstRowFirstColumn="0" w:firstRowLastColumn="0" w:lastRowFirstColumn="0" w:lastRowLastColumn="0"/>
+            </w:pPr>
+            <w:r>
+              <w:t>Assign to ESP32 PWM Channel in code.</w:t>
             </w:r>
           </w:p>
         </w:tc>
@@ -441,13 +622,8 @@
               <w:jc w:val="center"/>
             </w:pPr>
             <w:r>
-              <w:t xml:space="preserve">Front </w:t>
-            </w:r>
-            <w:proofErr w:type="spellStart"/>
-            <w:r>
-              <w:t>ToF</w:t>
-            </w:r>
-            <w:proofErr w:type="spellEnd"/>
+              <w:t>Servo 2</w:t>
+            </w:r>
           </w:p>
         </w:tc>
         <w:tc>
@@ -462,7 +638,7 @@
               <w:cnfStyle w:val="000000000000" w:firstRow="0" w:lastRow="0" w:firstColumn="0" w:lastColumn="0" w:oddVBand="0" w:evenVBand="0" w:oddHBand="0" w:evenHBand="0" w:firstRowFirstColumn="0" w:firstRowLastColumn="0" w:lastRowFirstColumn="0" w:lastRowLastColumn="0"/>
             </w:pPr>
             <w:r>
-              <w:t>XSHUT</w:t>
+              <w:t>PWM Signal</w:t>
             </w:r>
           </w:p>
         </w:tc>
@@ -478,7 +654,10 @@
               <w:cnfStyle w:val="000000000000" w:firstRow="0" w:lastRow="0" w:firstColumn="0" w:lastColumn="0" w:oddVBand="0" w:evenVBand="0" w:oddHBand="0" w:evenHBand="0" w:firstRowFirstColumn="0" w:firstRowLastColumn="0" w:lastRowFirstColumn="0" w:lastRowLastColumn="0"/>
             </w:pPr>
             <w:r>
-              <w:t>GPIO 14</w:t>
+              <w:t>GPIO 2</w:t>
+            </w:r>
+            <w:r>
+              <w:t>3</w:t>
             </w:r>
           </w:p>
         </w:tc>
@@ -510,7 +689,7 @@
               <w:cnfStyle w:val="000000000000" w:firstRow="0" w:lastRow="0" w:firstColumn="0" w:lastColumn="0" w:oddVBand="0" w:evenVBand="0" w:oddHBand="0" w:evenHBand="0" w:firstRowFirstColumn="0" w:firstRowLastColumn="0" w:lastRowFirstColumn="0" w:lastRowLastColumn="0"/>
             </w:pPr>
             <w:r>
-              <w:t>Pull HIGH in code to activate.</w:t>
+              <w:t>Assign to ESP32 PWM Channel in code.</w:t>
             </w:r>
           </w:p>
         </w:tc>
@@ -533,44 +712,39 @@
               <w:jc w:val="center"/>
             </w:pPr>
             <w:r>
-              <w:t xml:space="preserve">Right </w:t>
-            </w:r>
-            <w:proofErr w:type="spellStart"/>
-            <w:r>
-              <w:t>ToF</w:t>
-            </w:r>
-            <w:proofErr w:type="spellEnd"/>
-          </w:p>
-        </w:tc>
-        <w:tc>
-          <w:tcPr>
-            <w:tcW w:w="0" w:type="auto"/>
-            <w:hideMark/>
-          </w:tcPr>
-          <w:p>
-            <w:pPr>
-              <w:spacing w:before="240" w:line="360" w:lineRule="auto"/>
-              <w:jc w:val="center"/>
-              <w:cnfStyle w:val="000000100000" w:firstRow="0" w:lastRow="0" w:firstColumn="0" w:lastColumn="0" w:oddVBand="0" w:evenVBand="0" w:oddHBand="1" w:evenHBand="0" w:firstRowFirstColumn="0" w:firstRowLastColumn="0" w:lastRowFirstColumn="0" w:lastRowLastColumn="0"/>
-            </w:pPr>
-            <w:r>
-              <w:t>XSHUT</w:t>
-            </w:r>
-          </w:p>
-        </w:tc>
-        <w:tc>
-          <w:tcPr>
-            <w:tcW w:w="0" w:type="auto"/>
-            <w:hideMark/>
-          </w:tcPr>
-          <w:p>
-            <w:pPr>
-              <w:spacing w:before="240" w:line="360" w:lineRule="auto"/>
-              <w:jc w:val="center"/>
-              <w:cnfStyle w:val="000000100000" w:firstRow="0" w:lastRow="0" w:firstColumn="0" w:lastColumn="0" w:oddVBand="0" w:evenVBand="0" w:oddHBand="1" w:evenHBand="0" w:firstRowFirstColumn="0" w:firstRowLastColumn="0" w:lastRowFirstColumn="0" w:lastRowLastColumn="0"/>
-            </w:pPr>
-            <w:r>
-              <w:t>GPIO 27</w:t>
+              <w:t>Servo 3</w:t>
+            </w:r>
+          </w:p>
+        </w:tc>
+        <w:tc>
+          <w:tcPr>
+            <w:tcW w:w="0" w:type="auto"/>
+            <w:hideMark/>
+          </w:tcPr>
+          <w:p>
+            <w:pPr>
+              <w:spacing w:before="240" w:line="360" w:lineRule="auto"/>
+              <w:jc w:val="center"/>
+              <w:cnfStyle w:val="000000100000" w:firstRow="0" w:lastRow="0" w:firstColumn="0" w:lastColumn="0" w:oddVBand="0" w:evenVBand="0" w:oddHBand="1" w:evenHBand="0" w:firstRowFirstColumn="0" w:firstRowLastColumn="0" w:lastRowFirstColumn="0" w:lastRowLastColumn="0"/>
+            </w:pPr>
+            <w:r>
+              <w:t>PWM Signal</w:t>
+            </w:r>
+          </w:p>
+        </w:tc>
+        <w:tc>
+          <w:tcPr>
+            <w:tcW w:w="0" w:type="auto"/>
+            <w:hideMark/>
+          </w:tcPr>
+          <w:p>
+            <w:pPr>
+              <w:spacing w:before="240" w:line="360" w:lineRule="auto"/>
+              <w:jc w:val="center"/>
+              <w:cnfStyle w:val="000000100000" w:firstRow="0" w:lastRow="0" w:firstColumn="0" w:lastColumn="0" w:oddVBand="0" w:evenVBand="0" w:oddHBand="1" w:evenHBand="0" w:firstRowFirstColumn="0" w:firstRowLastColumn="0" w:lastRowFirstColumn="0" w:lastRowLastColumn="0"/>
+            </w:pPr>
+            <w:r>
+              <w:t>GPIO 32</w:t>
             </w:r>
           </w:p>
         </w:tc>
@@ -602,7 +776,204 @@
               <w:cnfStyle w:val="000000100000" w:firstRow="0" w:lastRow="0" w:firstColumn="0" w:lastColumn="0" w:oddVBand="0" w:evenVBand="0" w:oddHBand="1" w:evenHBand="0" w:firstRowFirstColumn="0" w:firstRowLastColumn="0" w:lastRowFirstColumn="0" w:lastRowLastColumn="0"/>
             </w:pPr>
             <w:r>
-              <w:t>Pull HIGH in code to activate.</w:t>
+              <w:t>Assign to ESP32 PWM Channel in code.</w:t>
+            </w:r>
+          </w:p>
+        </w:tc>
+      </w:tr>
+      <w:tr>
+        <w:trPr>
+          <w:trHeight w:val="813"/>
+          <w:jc w:val="center"/>
+        </w:trPr>
+        <w:tc>
+          <w:tcPr>
+            <w:cnfStyle w:val="001000000000" w:firstRow="0" w:lastRow="0" w:firstColumn="1" w:lastColumn="0" w:oddVBand="0" w:evenVBand="0" w:oddHBand="0" w:evenHBand="0" w:firstRowFirstColumn="0" w:firstRowLastColumn="0" w:lastRowFirstColumn="0" w:lastRowLastColumn="0"/>
+            <w:tcW w:w="0" w:type="auto"/>
+          </w:tcPr>
+          <w:p>
+            <w:pPr>
+              <w:spacing w:before="240" w:line="360" w:lineRule="auto"/>
+              <w:jc w:val="center"/>
+            </w:pPr>
+            <w:r>
+              <w:t xml:space="preserve">Servo </w:t>
+            </w:r>
+            <w:r>
+              <w:t>4</w:t>
+            </w:r>
+          </w:p>
+        </w:tc>
+        <w:tc>
+          <w:tcPr>
+            <w:tcW w:w="0" w:type="auto"/>
+          </w:tcPr>
+          <w:p>
+            <w:pPr>
+              <w:spacing w:before="240" w:line="360" w:lineRule="auto"/>
+              <w:jc w:val="center"/>
+              <w:cnfStyle w:val="000000000000" w:firstRow="0" w:lastRow="0" w:firstColumn="0" w:lastColumn="0" w:oddVBand="0" w:evenVBand="0" w:oddHBand="0" w:evenHBand="0" w:firstRowFirstColumn="0" w:firstRowLastColumn="0" w:lastRowFirstColumn="0" w:lastRowLastColumn="0"/>
+            </w:pPr>
+            <w:r>
+              <w:t>PWM Signal</w:t>
+            </w:r>
+          </w:p>
+        </w:tc>
+        <w:tc>
+          <w:tcPr>
+            <w:tcW w:w="0" w:type="auto"/>
+          </w:tcPr>
+          <w:p>
+            <w:pPr>
+              <w:spacing w:before="240" w:line="360" w:lineRule="auto"/>
+              <w:jc w:val="center"/>
+              <w:cnfStyle w:val="000000000000" w:firstRow="0" w:lastRow="0" w:firstColumn="0" w:lastColumn="0" w:oddVBand="0" w:evenVBand="0" w:oddHBand="0" w:evenHBand="0" w:firstRowFirstColumn="0" w:firstRowLastColumn="0" w:lastRowFirstColumn="0" w:lastRowLastColumn="0"/>
+            </w:pPr>
+            <w:r>
+              <w:t xml:space="preserve">GPIO </w:t>
+            </w:r>
+            <w:r>
+              <w:t>18</w:t>
+            </w:r>
+          </w:p>
+        </w:tc>
+        <w:tc>
+          <w:tcPr>
+            <w:tcW w:w="0" w:type="auto"/>
+          </w:tcPr>
+          <w:p>
+            <w:pPr>
+              <w:spacing w:before="240" w:line="360" w:lineRule="auto"/>
+              <w:jc w:val="center"/>
+              <w:cnfStyle w:val="000000000000" w:firstRow="0" w:lastRow="0" w:firstColumn="0" w:lastColumn="0" w:oddVBand="0" w:evenVBand="0" w:oddHBand="0" w:evenHBand="0" w:firstRowFirstColumn="0" w:firstRowLastColumn="0" w:lastRowFirstColumn="0" w:lastRowLastColumn="0"/>
+            </w:pPr>
+            <w:r>
+              <w:t>Safe</w:t>
+            </w:r>
+          </w:p>
+        </w:tc>
+        <w:tc>
+          <w:tcPr>
+            <w:tcW w:w="5789" w:type="dxa"/>
+          </w:tcPr>
+          <w:p>
+            <w:pPr>
+              <w:spacing w:before="240" w:line="360" w:lineRule="auto"/>
+              <w:jc w:val="center"/>
+              <w:cnfStyle w:val="000000000000" w:firstRow="0" w:lastRow="0" w:firstColumn="0" w:lastColumn="0" w:oddVBand="0" w:evenVBand="0" w:oddHBand="0" w:evenHBand="0" w:firstRowFirstColumn="0" w:firstRowLastColumn="0" w:lastRowFirstColumn="0" w:lastRowLastColumn="0"/>
+            </w:pPr>
+            <w:r>
+              <w:t>Assign to ESP32 PWM Channel in code.</w:t>
+            </w:r>
+          </w:p>
+        </w:tc>
+      </w:tr>
+      <w:tr>
+        <w:trPr>
+          <w:cnfStyle w:val="000000100000" w:firstRow="0" w:lastRow="0" w:firstColumn="0" w:lastColumn="0" w:oddVBand="0" w:evenVBand="0" w:oddHBand="1" w:evenHBand="0" w:firstRowFirstColumn="0" w:firstRowLastColumn="0" w:lastRowFirstColumn="0" w:lastRowLastColumn="0"/>
+          <w:trHeight w:val="813"/>
+          <w:jc w:val="center"/>
+        </w:trPr>
+        <w:tc>
+          <w:tcPr>
+            <w:cnfStyle w:val="001000000000" w:firstRow="0" w:lastRow="0" w:firstColumn="1" w:lastColumn="0" w:oddVBand="0" w:evenVBand="0" w:oddHBand="0" w:evenHBand="0" w:firstRowFirstColumn="0" w:firstRowLastColumn="0" w:lastRowFirstColumn="0" w:lastRowLastColumn="0"/>
+            <w:tcW w:w="0" w:type="auto"/>
+          </w:tcPr>
+          <w:p>
+            <w:pPr>
+              <w:spacing w:before="240" w:line="360" w:lineRule="auto"/>
+              <w:jc w:val="center"/>
+            </w:pPr>
+            <w:r>
+              <w:t xml:space="preserve">Servo </w:t>
+            </w:r>
+            <w:r>
+              <w:t>5</w:t>
+            </w:r>
+          </w:p>
+        </w:tc>
+        <w:tc>
+          <w:tcPr>
+            <w:tcW w:w="0" w:type="auto"/>
+          </w:tcPr>
+          <w:p>
+            <w:pPr>
+              <w:spacing w:before="240" w:line="360" w:lineRule="auto"/>
+              <w:jc w:val="center"/>
+              <w:cnfStyle w:val="000000100000" w:firstRow="0" w:lastRow="0" w:firstColumn="0" w:lastColumn="0" w:oddVBand="0" w:evenVBand="0" w:oddHBand="1" w:evenHBand="0" w:firstRowFirstColumn="0" w:firstRowLastColumn="0" w:lastRowFirstColumn="0" w:lastRowLastColumn="0"/>
+            </w:pPr>
+            <w:r>
+              <w:t>PWM Signal</w:t>
+            </w:r>
+          </w:p>
+        </w:tc>
+        <w:tc>
+          <w:tcPr>
+            <w:tcW w:w="0" w:type="auto"/>
+          </w:tcPr>
+          <w:p>
+            <w:pPr>
+              <w:spacing w:before="240" w:line="360" w:lineRule="auto"/>
+              <w:jc w:val="center"/>
+              <w:cnfStyle w:val="000000100000" w:firstRow="0" w:lastRow="0" w:firstColumn="0" w:lastColumn="0" w:oddVBand="0" w:evenVBand="0" w:oddHBand="1" w:evenHBand="0" w:firstRowFirstColumn="0" w:firstRowLastColumn="0" w:lastRowFirstColumn="0" w:lastRowLastColumn="0"/>
+            </w:pPr>
+            <w:r>
+              <w:rPr>
+                <w:b/>
+                <w:bCs/>
+              </w:rPr>
+              <w:t>GPIO 2</w:t>
+            </w:r>
+          </w:p>
+        </w:tc>
+        <w:tc>
+          <w:tcPr>
+            <w:tcW w:w="0" w:type="auto"/>
+          </w:tcPr>
+          <w:p>
+            <w:pPr>
+              <w:spacing w:before="240" w:line="360" w:lineRule="auto"/>
+              <w:jc w:val="center"/>
+              <w:cnfStyle w:val="000000100000" w:firstRow="0" w:lastRow="0" w:firstColumn="0" w:lastColumn="0" w:oddVBand="0" w:evenVBand="0" w:oddHBand="1" w:evenHBand="0" w:firstRowFirstColumn="0" w:firstRowLastColumn="0" w:lastRowFirstColumn="0" w:lastRowLastColumn="0"/>
+            </w:pPr>
+            <w:r>
+              <w:rPr>
+                <w:b/>
+                <w:bCs/>
+              </w:rPr>
+              <w:t>Strapping</w:t>
+            </w:r>
+          </w:p>
+        </w:tc>
+        <w:tc>
+          <w:tcPr>
+            <w:tcW w:w="5789" w:type="dxa"/>
+          </w:tcPr>
+          <w:p>
+            <w:pPr>
+              <w:spacing w:before="240" w:line="360" w:lineRule="auto"/>
+              <w:jc w:val="center"/>
+              <w:cnfStyle w:val="000000100000" w:firstRow="0" w:lastRow="0" w:firstColumn="0" w:lastColumn="0" w:oddVBand="0" w:evenVBand="0" w:oddHBand="1" w:evenHBand="0" w:firstRowFirstColumn="0" w:firstRowLastColumn="0" w:lastRowFirstColumn="0" w:lastRowLastColumn="0"/>
+              <w:rPr>
+                <w:b/>
+                <w:bCs/>
+              </w:rPr>
+            </w:pPr>
+            <w:r>
+              <w:rPr>
+                <w:rFonts w:ascii="Segoe UI Emoji" w:hAnsi="Segoe UI Emoji" w:cs="Segoe UI Emoji"/>
+              </w:rPr>
+              <w:t>⚠️</w:t>
+            </w:r>
+            <w:r>
+              <w:t xml:space="preserve"> </w:t>
+            </w:r>
+            <w:r>
+              <w:rPr>
+                <w:b/>
+                <w:bCs/>
+              </w:rPr>
+              <w:t>Must add a 10kΩ Pull-Down resistor to GND.</w:t>
             </w:r>
           </w:p>
         </w:tc>
@@ -624,7 +995,7 @@
               <w:jc w:val="center"/>
             </w:pPr>
             <w:r>
-              <w:t>Servo 1</w:t>
+              <w:t>DC Motor 1</w:t>
             </w:r>
           </w:p>
         </w:tc>
@@ -640,7 +1011,7 @@
               <w:cnfStyle w:val="000000000000" w:firstRow="0" w:lastRow="0" w:firstColumn="0" w:lastColumn="0" w:oddVBand="0" w:evenVBand="0" w:oddHBand="0" w:evenHBand="0" w:firstRowFirstColumn="0" w:firstRowLastColumn="0" w:lastRowFirstColumn="0" w:lastRowLastColumn="0"/>
             </w:pPr>
             <w:r>
-              <w:t>PWM Signal</w:t>
+              <w:t>Speed (PWM)</w:t>
             </w:r>
           </w:p>
         </w:tc>
@@ -656,7 +1027,7 @@
               <w:cnfStyle w:val="000000000000" w:firstRow="0" w:lastRow="0" w:firstColumn="0" w:lastColumn="0" w:oddVBand="0" w:evenVBand="0" w:oddHBand="0" w:evenHBand="0" w:firstRowFirstColumn="0" w:firstRowLastColumn="0" w:lastRowFirstColumn="0" w:lastRowLastColumn="0"/>
             </w:pPr>
             <w:r>
-              <w:t>GPIO 25</w:t>
+              <w:t>GPIO 33</w:t>
             </w:r>
           </w:p>
         </w:tc>
@@ -688,7 +1059,180 @@
               <w:cnfStyle w:val="000000000000" w:firstRow="0" w:lastRow="0" w:firstColumn="0" w:lastColumn="0" w:oddVBand="0" w:evenVBand="0" w:oddHBand="0" w:evenHBand="0" w:firstRowFirstColumn="0" w:firstRowLastColumn="0" w:lastRowFirstColumn="0" w:lastRowLastColumn="0"/>
             </w:pPr>
             <w:r>
-              <w:t>Assign to ESP32 PWM Channel in code.</w:t>
+              <w:t>Connect to Motor Driver Enable pin.</w:t>
+            </w:r>
+          </w:p>
+        </w:tc>
+      </w:tr>
+      <w:tr>
+        <w:trPr>
+          <w:cnfStyle w:val="000000100000" w:firstRow="0" w:lastRow="0" w:firstColumn="0" w:lastColumn="0" w:oddVBand="0" w:evenVBand="0" w:oddHBand="1" w:evenHBand="0" w:firstRowFirstColumn="0" w:firstRowLastColumn="0" w:lastRowFirstColumn="0" w:lastRowLastColumn="0"/>
+          <w:trHeight w:val="813"/>
+          <w:jc w:val="center"/>
+        </w:trPr>
+        <w:tc>
+          <w:tcPr>
+            <w:cnfStyle w:val="001000000000" w:firstRow="0" w:lastRow="0" w:firstColumn="1" w:lastColumn="0" w:oddVBand="0" w:evenVBand="0" w:oddHBand="0" w:evenHBand="0" w:firstRowFirstColumn="0" w:firstRowLastColumn="0" w:lastRowFirstColumn="0" w:lastRowLastColumn="0"/>
+            <w:tcW w:w="0" w:type="auto"/>
+            <w:hideMark/>
+          </w:tcPr>
+          <w:p>
+            <w:pPr>
+              <w:spacing w:before="240" w:line="360" w:lineRule="auto"/>
+              <w:jc w:val="center"/>
+            </w:pPr>
+            <w:r>
+              <w:t>DC Motor 1</w:t>
+            </w:r>
+          </w:p>
+        </w:tc>
+        <w:tc>
+          <w:tcPr>
+            <w:tcW w:w="0" w:type="auto"/>
+            <w:hideMark/>
+          </w:tcPr>
+          <w:p>
+            <w:pPr>
+              <w:spacing w:before="240" w:line="360" w:lineRule="auto"/>
+              <w:jc w:val="center"/>
+              <w:cnfStyle w:val="000000100000" w:firstRow="0" w:lastRow="0" w:firstColumn="0" w:lastColumn="0" w:oddVBand="0" w:evenVBand="0" w:oddHBand="1" w:evenHBand="0" w:firstRowFirstColumn="0" w:firstRowLastColumn="0" w:lastRowFirstColumn="0" w:lastRowLastColumn="0"/>
+            </w:pPr>
+            <w:r>
+              <w:t>Direction (DIR)</w:t>
+            </w:r>
+          </w:p>
+        </w:tc>
+        <w:tc>
+          <w:tcPr>
+            <w:tcW w:w="0" w:type="auto"/>
+            <w:hideMark/>
+          </w:tcPr>
+          <w:p>
+            <w:pPr>
+              <w:spacing w:before="240" w:line="360" w:lineRule="auto"/>
+              <w:jc w:val="center"/>
+              <w:cnfStyle w:val="000000100000" w:firstRow="0" w:lastRow="0" w:firstColumn="0" w:lastColumn="0" w:oddVBand="0" w:evenVBand="0" w:oddHBand="1" w:evenHBand="0" w:firstRowFirstColumn="0" w:firstRowLastColumn="0" w:lastRowFirstColumn="0" w:lastRowLastColumn="0"/>
+            </w:pPr>
+            <w:r>
+              <w:t>GPIO 19</w:t>
+            </w:r>
+          </w:p>
+        </w:tc>
+        <w:tc>
+          <w:tcPr>
+            <w:tcW w:w="0" w:type="auto"/>
+            <w:hideMark/>
+          </w:tcPr>
+          <w:p>
+            <w:pPr>
+              <w:spacing w:before="240" w:line="360" w:lineRule="auto"/>
+              <w:jc w:val="center"/>
+              <w:cnfStyle w:val="000000100000" w:firstRow="0" w:lastRow="0" w:firstColumn="0" w:lastColumn="0" w:oddVBand="0" w:evenVBand="0" w:oddHBand="1" w:evenHBand="0" w:firstRowFirstColumn="0" w:firstRowLastColumn="0" w:lastRowFirstColumn="0" w:lastRowLastColumn="0"/>
+            </w:pPr>
+            <w:r>
+              <w:t>Safe</w:t>
+            </w:r>
+          </w:p>
+        </w:tc>
+        <w:tc>
+          <w:tcPr>
+            <w:tcW w:w="5789" w:type="dxa"/>
+            <w:hideMark/>
+          </w:tcPr>
+          <w:p>
+            <w:pPr>
+              <w:spacing w:before="240" w:line="360" w:lineRule="auto"/>
+              <w:jc w:val="center"/>
+              <w:cnfStyle w:val="000000100000" w:firstRow="0" w:lastRow="0" w:firstColumn="0" w:lastColumn="0" w:oddVBand="0" w:evenVBand="0" w:oddHBand="1" w:evenHBand="0" w:firstRowFirstColumn="0" w:firstRowLastColumn="0" w:lastRowFirstColumn="0" w:lastRowLastColumn="0"/>
+            </w:pPr>
+            <w:r>
+              <w:t>Connect to IN1 (and NOT gate to IN2).</w:t>
+            </w:r>
+          </w:p>
+        </w:tc>
+      </w:tr>
+      <w:tr>
+        <w:trPr>
+          <w:trHeight w:val="787"/>
+          <w:jc w:val="center"/>
+        </w:trPr>
+        <w:tc>
+          <w:tcPr>
+            <w:cnfStyle w:val="001000000000" w:firstRow="0" w:lastRow="0" w:firstColumn="1" w:lastColumn="0" w:oddVBand="0" w:evenVBand="0" w:oddHBand="0" w:evenHBand="0" w:firstRowFirstColumn="0" w:firstRowLastColumn="0" w:lastRowFirstColumn="0" w:lastRowLastColumn="0"/>
+            <w:tcW w:w="0" w:type="auto"/>
+            <w:hideMark/>
+          </w:tcPr>
+          <w:p>
+            <w:pPr>
+              <w:spacing w:before="240" w:line="360" w:lineRule="auto"/>
+              <w:jc w:val="center"/>
+            </w:pPr>
+            <w:r>
+              <w:t>DC Motor 2</w:t>
+            </w:r>
+          </w:p>
+        </w:tc>
+        <w:tc>
+          <w:tcPr>
+            <w:tcW w:w="0" w:type="auto"/>
+            <w:hideMark/>
+          </w:tcPr>
+          <w:p>
+            <w:pPr>
+              <w:spacing w:before="240" w:line="360" w:lineRule="auto"/>
+              <w:jc w:val="center"/>
+              <w:cnfStyle w:val="000000000000" w:firstRow="0" w:lastRow="0" w:firstColumn="0" w:lastColumn="0" w:oddVBand="0" w:evenVBand="0" w:oddHBand="0" w:evenHBand="0" w:firstRowFirstColumn="0" w:firstRowLastColumn="0" w:lastRowFirstColumn="0" w:lastRowLastColumn="0"/>
+            </w:pPr>
+            <w:r>
+              <w:t>Speed (PWM)</w:t>
+            </w:r>
+          </w:p>
+        </w:tc>
+        <w:tc>
+          <w:tcPr>
+            <w:tcW w:w="0" w:type="auto"/>
+            <w:hideMark/>
+          </w:tcPr>
+          <w:p>
+            <w:pPr>
+              <w:spacing w:before="240" w:line="360" w:lineRule="auto"/>
+              <w:jc w:val="center"/>
+              <w:cnfStyle w:val="000000000000" w:firstRow="0" w:lastRow="0" w:firstColumn="0" w:lastColumn="0" w:oddVBand="0" w:evenVBand="0" w:oddHBand="0" w:evenHBand="0" w:firstRowFirstColumn="0" w:firstRowLastColumn="0" w:lastRowFirstColumn="0" w:lastRowLastColumn="0"/>
+            </w:pPr>
+            <w:r>
+              <w:t>GPIO 4</w:t>
+            </w:r>
+          </w:p>
+        </w:tc>
+        <w:tc>
+          <w:tcPr>
+            <w:tcW w:w="0" w:type="auto"/>
+            <w:hideMark/>
+          </w:tcPr>
+          <w:p>
+            <w:pPr>
+              <w:spacing w:before="240" w:line="360" w:lineRule="auto"/>
+              <w:jc w:val="center"/>
+              <w:cnfStyle w:val="000000000000" w:firstRow="0" w:lastRow="0" w:firstColumn="0" w:lastColumn="0" w:oddVBand="0" w:evenVBand="0" w:oddHBand="0" w:evenHBand="0" w:firstRowFirstColumn="0" w:firstRowLastColumn="0" w:lastRowFirstColumn="0" w:lastRowLastColumn="0"/>
+            </w:pPr>
+            <w:r>
+              <w:t>Safe</w:t>
+            </w:r>
+          </w:p>
+        </w:tc>
+        <w:tc>
+          <w:tcPr>
+            <w:tcW w:w="5789" w:type="dxa"/>
+            <w:hideMark/>
+          </w:tcPr>
+          <w:p>
+            <w:pPr>
+              <w:spacing w:before="240" w:line="360" w:lineRule="auto"/>
+              <w:jc w:val="center"/>
+              <w:cnfStyle w:val="000000000000" w:firstRow="0" w:lastRow="0" w:firstColumn="0" w:lastColumn="0" w:oddVBand="0" w:evenVBand="0" w:oddHBand="0" w:evenHBand="0" w:firstRowFirstColumn="0" w:firstRowLastColumn="0" w:lastRowFirstColumn="0" w:lastRowLastColumn="0"/>
+            </w:pPr>
+            <w:r>
+              <w:t>Connect to Motor Driver Enable pin.</w:t>
             </w:r>
           </w:p>
         </w:tc>
@@ -711,39 +1255,42 @@
               <w:jc w:val="center"/>
             </w:pPr>
             <w:r>
-              <w:t>Servo 2</w:t>
-            </w:r>
-          </w:p>
-        </w:tc>
-        <w:tc>
-          <w:tcPr>
-            <w:tcW w:w="0" w:type="auto"/>
-            <w:hideMark/>
-          </w:tcPr>
-          <w:p>
-            <w:pPr>
-              <w:spacing w:before="240" w:line="360" w:lineRule="auto"/>
-              <w:jc w:val="center"/>
-              <w:cnfStyle w:val="000000100000" w:firstRow="0" w:lastRow="0" w:firstColumn="0" w:lastColumn="0" w:oddVBand="0" w:evenVBand="0" w:oddHBand="1" w:evenHBand="0" w:firstRowFirstColumn="0" w:firstRowLastColumn="0" w:lastRowFirstColumn="0" w:lastRowLastColumn="0"/>
-            </w:pPr>
-            <w:r>
-              <w:t>PWM Signal</w:t>
-            </w:r>
-          </w:p>
-        </w:tc>
-        <w:tc>
-          <w:tcPr>
-            <w:tcW w:w="0" w:type="auto"/>
-            <w:hideMark/>
-          </w:tcPr>
-          <w:p>
-            <w:pPr>
-              <w:spacing w:before="240" w:line="360" w:lineRule="auto"/>
-              <w:jc w:val="center"/>
-              <w:cnfStyle w:val="000000100000" w:firstRow="0" w:lastRow="0" w:firstColumn="0" w:lastColumn="0" w:oddVBand="0" w:evenVBand="0" w:oddHBand="1" w:evenHBand="0" w:firstRowFirstColumn="0" w:firstRowLastColumn="0" w:lastRowFirstColumn="0" w:lastRowLastColumn="0"/>
-            </w:pPr>
-            <w:r>
-              <w:t>GPIO 26</w:t>
+              <w:t>DC Motor 2</w:t>
+            </w:r>
+          </w:p>
+        </w:tc>
+        <w:tc>
+          <w:tcPr>
+            <w:tcW w:w="0" w:type="auto"/>
+            <w:hideMark/>
+          </w:tcPr>
+          <w:p>
+            <w:pPr>
+              <w:spacing w:before="240" w:line="360" w:lineRule="auto"/>
+              <w:jc w:val="center"/>
+              <w:cnfStyle w:val="000000100000" w:firstRow="0" w:lastRow="0" w:firstColumn="0" w:lastColumn="0" w:oddVBand="0" w:evenVBand="0" w:oddHBand="1" w:evenHBand="0" w:firstRowFirstColumn="0" w:firstRowLastColumn="0" w:lastRowFirstColumn="0" w:lastRowLastColumn="0"/>
+            </w:pPr>
+            <w:r>
+              <w:t>Direction (DIR)</w:t>
+            </w:r>
+          </w:p>
+        </w:tc>
+        <w:tc>
+          <w:tcPr>
+            <w:tcW w:w="0" w:type="auto"/>
+            <w:hideMark/>
+          </w:tcPr>
+          <w:p>
+            <w:pPr>
+              <w:spacing w:before="240" w:line="360" w:lineRule="auto"/>
+              <w:jc w:val="center"/>
+              <w:cnfStyle w:val="000000100000" w:firstRow="0" w:lastRow="0" w:firstColumn="0" w:lastColumn="0" w:oddVBand="0" w:evenVBand="0" w:oddHBand="1" w:evenHBand="0" w:firstRowFirstColumn="0" w:firstRowLastColumn="0" w:lastRowFirstColumn="0" w:lastRowLastColumn="0"/>
+            </w:pPr>
+            <w:r>
+              <w:t>GPIO 2</w:t>
+            </w:r>
+            <w:r>
+              <w:t>6</w:t>
             </w:r>
           </w:p>
         </w:tc>
@@ -775,7 +1322,7 @@
               <w:cnfStyle w:val="000000100000" w:firstRow="0" w:lastRow="0" w:firstColumn="0" w:lastColumn="0" w:oddVBand="0" w:evenVBand="0" w:oddHBand="1" w:evenHBand="0" w:firstRowFirstColumn="0" w:firstRowLastColumn="0" w:lastRowFirstColumn="0" w:lastRowLastColumn="0"/>
             </w:pPr>
             <w:r>
-              <w:t>Assign to ESP32 PWM Channel in code.</w:t>
+              <w:t>Connect to IN1 (and NOT gate to IN2).</w:t>
             </w:r>
           </w:p>
         </w:tc>
@@ -797,7 +1344,7 @@
               <w:jc w:val="center"/>
             </w:pPr>
             <w:r>
-              <w:t>Servo 3</w:t>
+              <w:t>DC Motor 3</w:t>
             </w:r>
           </w:p>
         </w:tc>
@@ -813,7 +1360,7 @@
               <w:cnfStyle w:val="000000000000" w:firstRow="0" w:lastRow="0" w:firstColumn="0" w:lastColumn="0" w:oddVBand="0" w:evenVBand="0" w:oddHBand="0" w:evenHBand="0" w:firstRowFirstColumn="0" w:firstRowLastColumn="0" w:lastRowFirstColumn="0" w:lastRowLastColumn="0"/>
             </w:pPr>
             <w:r>
-              <w:t>PWM Signal</w:t>
+              <w:t>Speed (PWM)</w:t>
             </w:r>
           </w:p>
         </w:tc>
@@ -829,7 +1376,7 @@
               <w:cnfStyle w:val="000000000000" w:firstRow="0" w:lastRow="0" w:firstColumn="0" w:lastColumn="0" w:oddVBand="0" w:evenVBand="0" w:oddHBand="0" w:evenHBand="0" w:firstRowFirstColumn="0" w:firstRowLastColumn="0" w:lastRowFirstColumn="0" w:lastRowLastColumn="0"/>
             </w:pPr>
             <w:r>
-              <w:t>GPIO 32</w:t>
+              <w:t>GPIO 16</w:t>
             </w:r>
           </w:p>
         </w:tc>
@@ -861,7 +1408,7 @@
               <w:cnfStyle w:val="000000000000" w:firstRow="0" w:lastRow="0" w:firstColumn="0" w:lastColumn="0" w:oddVBand="0" w:evenVBand="0" w:oddHBand="0" w:evenHBand="0" w:firstRowFirstColumn="0" w:firstRowLastColumn="0" w:lastRowFirstColumn="0" w:lastRowLastColumn="0"/>
             </w:pPr>
             <w:r>
-              <w:t>Assign to ESP32 PWM Channel in code.</w:t>
+              <w:t>Connect to Motor Driver Enable pin.</w:t>
             </w:r>
           </w:p>
         </w:tc>
@@ -869,157 +1416,71 @@
       <w:tr>
         <w:trPr>
           <w:cnfStyle w:val="000000100000" w:firstRow="0" w:lastRow="0" w:firstColumn="0" w:lastColumn="0" w:oddVBand="0" w:evenVBand="0" w:oddHBand="1" w:evenHBand="0" w:firstRowFirstColumn="0" w:firstRowLastColumn="0" w:lastRowFirstColumn="0" w:lastRowLastColumn="0"/>
-          <w:trHeight w:val="813"/>
+          <w:trHeight w:val="868"/>
           <w:jc w:val="center"/>
         </w:trPr>
         <w:tc>
           <w:tcPr>
             <w:cnfStyle w:val="001000000000" w:firstRow="0" w:lastRow="0" w:firstColumn="1" w:lastColumn="0" w:oddVBand="0" w:evenVBand="0" w:oddHBand="0" w:evenHBand="0" w:firstRowFirstColumn="0" w:firstRowLastColumn="0" w:lastRowFirstColumn="0" w:lastRowLastColumn="0"/>
             <w:tcW w:w="0" w:type="auto"/>
-          </w:tcPr>
-          <w:p>
-            <w:pPr>
-              <w:spacing w:before="240" w:line="360" w:lineRule="auto"/>
-              <w:jc w:val="center"/>
-            </w:pPr>
-            <w:r>
-              <w:t xml:space="preserve">Servo </w:t>
-            </w:r>
-            <w:r>
-              <w:t>4</w:t>
-            </w:r>
-          </w:p>
-        </w:tc>
-        <w:tc>
-          <w:tcPr>
-            <w:tcW w:w="0" w:type="auto"/>
-          </w:tcPr>
-          <w:p>
-            <w:pPr>
-              <w:spacing w:before="240" w:line="360" w:lineRule="auto"/>
-              <w:jc w:val="center"/>
-              <w:cnfStyle w:val="000000100000" w:firstRow="0" w:lastRow="0" w:firstColumn="0" w:lastColumn="0" w:oddVBand="0" w:evenVBand="0" w:oddHBand="1" w:evenHBand="0" w:firstRowFirstColumn="0" w:firstRowLastColumn="0" w:lastRowFirstColumn="0" w:lastRowLastColumn="0"/>
-            </w:pPr>
-            <w:r>
-              <w:t>PWM Signal</w:t>
-            </w:r>
-          </w:p>
-        </w:tc>
-        <w:tc>
-          <w:tcPr>
-            <w:tcW w:w="0" w:type="auto"/>
-          </w:tcPr>
-          <w:p>
-            <w:pPr>
-              <w:spacing w:before="240" w:line="360" w:lineRule="auto"/>
-              <w:jc w:val="center"/>
-              <w:cnfStyle w:val="000000100000" w:firstRow="0" w:lastRow="0" w:firstColumn="0" w:lastColumn="0" w:oddVBand="0" w:evenVBand="0" w:oddHBand="1" w:evenHBand="0" w:firstRowFirstColumn="0" w:firstRowLastColumn="0" w:lastRowFirstColumn="0" w:lastRowLastColumn="0"/>
-            </w:pPr>
-            <w:r>
-              <w:t xml:space="preserve">GPIO </w:t>
-            </w:r>
-            <w:r>
-              <w:t>18</w:t>
-            </w:r>
-          </w:p>
-        </w:tc>
-        <w:tc>
-          <w:tcPr>
-            <w:tcW w:w="0" w:type="auto"/>
-          </w:tcPr>
-          <w:p>
-            <w:pPr>
-              <w:spacing w:before="240" w:line="360" w:lineRule="auto"/>
-              <w:jc w:val="center"/>
-              <w:cnfStyle w:val="000000100000" w:firstRow="0" w:lastRow="0" w:firstColumn="0" w:lastColumn="0" w:oddVBand="0" w:evenVBand="0" w:oddHBand="1" w:evenHBand="0" w:firstRowFirstColumn="0" w:firstRowLastColumn="0" w:lastRowFirstColumn="0" w:lastRowLastColumn="0"/>
-            </w:pPr>
-            <w:r>
-              <w:t>Safe</w:t>
-            </w:r>
-          </w:p>
-        </w:tc>
-        <w:tc>
-          <w:tcPr>
-            <w:tcW w:w="5789" w:type="dxa"/>
-          </w:tcPr>
-          <w:p>
-            <w:pPr>
-              <w:spacing w:before="240" w:line="360" w:lineRule="auto"/>
-              <w:jc w:val="center"/>
-              <w:cnfStyle w:val="000000100000" w:firstRow="0" w:lastRow="0" w:firstColumn="0" w:lastColumn="0" w:oddVBand="0" w:evenVBand="0" w:oddHBand="1" w:evenHBand="0" w:firstRowFirstColumn="0" w:firstRowLastColumn="0" w:lastRowFirstColumn="0" w:lastRowLastColumn="0"/>
-            </w:pPr>
-            <w:r>
-              <w:t>Assign to ESP32 PWM Channel in code.</w:t>
-            </w:r>
-          </w:p>
-        </w:tc>
-      </w:tr>
-      <w:tr>
-        <w:trPr>
-          <w:trHeight w:val="813"/>
-          <w:jc w:val="center"/>
-        </w:trPr>
-        <w:tc>
-          <w:tcPr>
-            <w:cnfStyle w:val="001000000000" w:firstRow="0" w:lastRow="0" w:firstColumn="1" w:lastColumn="0" w:oddVBand="0" w:evenVBand="0" w:oddHBand="0" w:evenHBand="0" w:firstRowFirstColumn="0" w:firstRowLastColumn="0" w:lastRowFirstColumn="0" w:lastRowLastColumn="0"/>
-            <w:tcW w:w="0" w:type="auto"/>
-          </w:tcPr>
-          <w:p>
-            <w:pPr>
-              <w:spacing w:before="240" w:line="360" w:lineRule="auto"/>
-              <w:jc w:val="center"/>
-            </w:pPr>
-            <w:r>
-              <w:t xml:space="preserve">Servo </w:t>
-            </w:r>
-            <w:r>
-              <w:t>5</w:t>
-            </w:r>
-          </w:p>
-        </w:tc>
-        <w:tc>
-          <w:tcPr>
-            <w:tcW w:w="0" w:type="auto"/>
-          </w:tcPr>
-          <w:p>
-            <w:pPr>
-              <w:spacing w:before="240" w:line="360" w:lineRule="auto"/>
-              <w:jc w:val="center"/>
-              <w:cnfStyle w:val="000000000000" w:firstRow="0" w:lastRow="0" w:firstColumn="0" w:lastColumn="0" w:oddVBand="0" w:evenVBand="0" w:oddHBand="0" w:evenHBand="0" w:firstRowFirstColumn="0" w:firstRowLastColumn="0" w:lastRowFirstColumn="0" w:lastRowLastColumn="0"/>
-            </w:pPr>
-            <w:r>
-              <w:t>PWM Signal</w:t>
-            </w:r>
-          </w:p>
-        </w:tc>
-        <w:tc>
-          <w:tcPr>
-            <w:tcW w:w="0" w:type="auto"/>
-          </w:tcPr>
-          <w:p>
-            <w:pPr>
-              <w:spacing w:before="240" w:line="360" w:lineRule="auto"/>
-              <w:jc w:val="center"/>
-              <w:cnfStyle w:val="000000000000" w:firstRow="0" w:lastRow="0" w:firstColumn="0" w:lastColumn="0" w:oddVBand="0" w:evenVBand="0" w:oddHBand="0" w:evenHBand="0" w:firstRowFirstColumn="0" w:firstRowLastColumn="0" w:lastRowFirstColumn="0" w:lastRowLastColumn="0"/>
+            <w:hideMark/>
+          </w:tcPr>
+          <w:p>
+            <w:pPr>
+              <w:spacing w:before="240" w:line="360" w:lineRule="auto"/>
+              <w:jc w:val="center"/>
+            </w:pPr>
+            <w:r>
+              <w:t>DC Motor 3</w:t>
+            </w:r>
+          </w:p>
+        </w:tc>
+        <w:tc>
+          <w:tcPr>
+            <w:tcW w:w="0" w:type="auto"/>
+            <w:hideMark/>
+          </w:tcPr>
+          <w:p>
+            <w:pPr>
+              <w:spacing w:before="240" w:line="360" w:lineRule="auto"/>
+              <w:jc w:val="center"/>
+              <w:cnfStyle w:val="000000100000" w:firstRow="0" w:lastRow="0" w:firstColumn="0" w:lastColumn="0" w:oddVBand="0" w:evenVBand="0" w:oddHBand="1" w:evenHBand="0" w:firstRowFirstColumn="0" w:firstRowLastColumn="0" w:lastRowFirstColumn="0" w:lastRowLastColumn="0"/>
+            </w:pPr>
+            <w:r>
+              <w:t>Direction (DIR)</w:t>
+            </w:r>
+          </w:p>
+        </w:tc>
+        <w:tc>
+          <w:tcPr>
+            <w:tcW w:w="0" w:type="auto"/>
+            <w:hideMark/>
+          </w:tcPr>
+          <w:p>
+            <w:pPr>
+              <w:spacing w:before="240" w:line="360" w:lineRule="auto"/>
+              <w:jc w:val="center"/>
+              <w:cnfStyle w:val="000000100000" w:firstRow="0" w:lastRow="0" w:firstColumn="0" w:lastColumn="0" w:oddVBand="0" w:evenVBand="0" w:oddHBand="1" w:evenHBand="0" w:firstRowFirstColumn="0" w:firstRowLastColumn="0" w:lastRowFirstColumn="0" w:lastRowLastColumn="0"/>
             </w:pPr>
             <w:r>
               <w:rPr>
                 <w:b/>
                 <w:bCs/>
               </w:rPr>
-              <w:t>GPIO 2</w:t>
-            </w:r>
-          </w:p>
-        </w:tc>
-        <w:tc>
-          <w:tcPr>
-            <w:tcW w:w="0" w:type="auto"/>
-          </w:tcPr>
-          <w:p>
-            <w:pPr>
-              <w:spacing w:before="240" w:line="360" w:lineRule="auto"/>
-              <w:jc w:val="center"/>
-              <w:cnfStyle w:val="000000000000" w:firstRow="0" w:lastRow="0" w:firstColumn="0" w:lastColumn="0" w:oddVBand="0" w:evenVBand="0" w:oddHBand="0" w:evenHBand="0" w:firstRowFirstColumn="0" w:firstRowLastColumn="0" w:lastRowFirstColumn="0" w:lastRowLastColumn="0"/>
+              <w:t>GPIO 5</w:t>
+            </w:r>
+          </w:p>
+        </w:tc>
+        <w:tc>
+          <w:tcPr>
+            <w:tcW w:w="0" w:type="auto"/>
+            <w:hideMark/>
+          </w:tcPr>
+          <w:p>
+            <w:pPr>
+              <w:spacing w:before="240" w:line="360" w:lineRule="auto"/>
+              <w:jc w:val="center"/>
+              <w:cnfStyle w:val="000000100000" w:firstRow="0" w:lastRow="0" w:firstColumn="0" w:lastColumn="0" w:oddVBand="0" w:evenVBand="0" w:oddHBand="1" w:evenHBand="0" w:firstRowFirstColumn="0" w:firstRowLastColumn="0" w:lastRowFirstColumn="0" w:lastRowLastColumn="0"/>
             </w:pPr>
             <w:r>
               <w:rPr>
@@ -1033,292 +1494,29 @@
         <w:tc>
           <w:tcPr>
             <w:tcW w:w="5789" w:type="dxa"/>
-          </w:tcPr>
-          <w:p>
-            <w:pPr>
-              <w:spacing w:before="240" w:line="360" w:lineRule="auto"/>
-              <w:jc w:val="center"/>
-              <w:cnfStyle w:val="000000000000" w:firstRow="0" w:lastRow="0" w:firstColumn="0" w:lastColumn="0" w:oddVBand="0" w:evenVBand="0" w:oddHBand="0" w:evenHBand="0" w:firstRowFirstColumn="0" w:firstRowLastColumn="0" w:lastRowFirstColumn="0" w:lastRowLastColumn="0"/>
+            <w:hideMark/>
+          </w:tcPr>
+          <w:p>
+            <w:pPr>
+              <w:spacing w:before="240" w:line="360" w:lineRule="auto"/>
+              <w:jc w:val="center"/>
+              <w:cnfStyle w:val="000000100000" w:firstRow="0" w:lastRow="0" w:firstColumn="0" w:lastColumn="0" w:oddVBand="0" w:evenVBand="0" w:oddHBand="1" w:evenHBand="0" w:firstRowFirstColumn="0" w:firstRowLastColumn="0" w:lastRowFirstColumn="0" w:lastRowLastColumn="0"/>
+            </w:pPr>
+            <w:r>
+              <w:rPr>
+                <w:rFonts w:ascii="Segoe UI Emoji" w:hAnsi="Segoe UI Emoji" w:cs="Segoe UI Emoji"/>
+              </w:rPr>
+              <w:t>⚠️</w:t>
+            </w:r>
+            <w:r>
+              <w:t xml:space="preserve"> </w:t>
+            </w:r>
+            <w:r>
               <w:rPr>
                 <w:b/>
                 <w:bCs/>
               </w:rPr>
-            </w:pPr>
-            <w:r>
-              <w:rPr>
-                <w:rFonts w:ascii="Segoe UI Emoji" w:hAnsi="Segoe UI Emoji" w:cs="Segoe UI Emoji"/>
-              </w:rPr>
-              <w:t>⚠️</w:t>
-            </w:r>
-            <w:r>
-              <w:t xml:space="preserve"> </w:t>
-            </w:r>
-            <w:r>
-              <w:rPr>
-                <w:b/>
-                <w:bCs/>
-              </w:rPr>
-              <w:t>Must add a 10kΩ Pull-Down resistor to GND.</w:t>
-            </w:r>
-          </w:p>
-        </w:tc>
-      </w:tr>
-      <w:tr>
-        <w:trPr>
-          <w:cnfStyle w:val="000000100000" w:firstRow="0" w:lastRow="0" w:firstColumn="0" w:lastColumn="0" w:oddVBand="0" w:evenVBand="0" w:oddHBand="1" w:evenHBand="0" w:firstRowFirstColumn="0" w:firstRowLastColumn="0" w:lastRowFirstColumn="0" w:lastRowLastColumn="0"/>
-          <w:trHeight w:val="787"/>
-          <w:jc w:val="center"/>
-        </w:trPr>
-        <w:tc>
-          <w:tcPr>
-            <w:cnfStyle w:val="001000000000" w:firstRow="0" w:lastRow="0" w:firstColumn="1" w:lastColumn="0" w:oddVBand="0" w:evenVBand="0" w:oddHBand="0" w:evenHBand="0" w:firstRowFirstColumn="0" w:firstRowLastColumn="0" w:lastRowFirstColumn="0" w:lastRowLastColumn="0"/>
-            <w:tcW w:w="0" w:type="auto"/>
-            <w:hideMark/>
-          </w:tcPr>
-          <w:p>
-            <w:pPr>
-              <w:spacing w:before="240" w:line="360" w:lineRule="auto"/>
-              <w:jc w:val="center"/>
-            </w:pPr>
-            <w:r>
-              <w:t>DC Motor 1</w:t>
-            </w:r>
-          </w:p>
-        </w:tc>
-        <w:tc>
-          <w:tcPr>
-            <w:tcW w:w="0" w:type="auto"/>
-            <w:hideMark/>
-          </w:tcPr>
-          <w:p>
-            <w:pPr>
-              <w:spacing w:before="240" w:line="360" w:lineRule="auto"/>
-              <w:jc w:val="center"/>
-              <w:cnfStyle w:val="000000100000" w:firstRow="0" w:lastRow="0" w:firstColumn="0" w:lastColumn="0" w:oddVBand="0" w:evenVBand="0" w:oddHBand="1" w:evenHBand="0" w:firstRowFirstColumn="0" w:firstRowLastColumn="0" w:lastRowFirstColumn="0" w:lastRowLastColumn="0"/>
-            </w:pPr>
-            <w:r>
-              <w:t>Speed (PWM)</w:t>
-            </w:r>
-          </w:p>
-        </w:tc>
-        <w:tc>
-          <w:tcPr>
-            <w:tcW w:w="0" w:type="auto"/>
-            <w:hideMark/>
-          </w:tcPr>
-          <w:p>
-            <w:pPr>
-              <w:spacing w:before="240" w:line="360" w:lineRule="auto"/>
-              <w:jc w:val="center"/>
-              <w:cnfStyle w:val="000000100000" w:firstRow="0" w:lastRow="0" w:firstColumn="0" w:lastColumn="0" w:oddVBand="0" w:evenVBand="0" w:oddHBand="1" w:evenHBand="0" w:firstRowFirstColumn="0" w:firstRowLastColumn="0" w:lastRowFirstColumn="0" w:lastRowLastColumn="0"/>
-            </w:pPr>
-            <w:r>
-              <w:t>GPIO 33</w:t>
-            </w:r>
-          </w:p>
-        </w:tc>
-        <w:tc>
-          <w:tcPr>
-            <w:tcW w:w="0" w:type="auto"/>
-            <w:hideMark/>
-          </w:tcPr>
-          <w:p>
-            <w:pPr>
-              <w:spacing w:before="240" w:line="360" w:lineRule="auto"/>
-              <w:jc w:val="center"/>
-              <w:cnfStyle w:val="000000100000" w:firstRow="0" w:lastRow="0" w:firstColumn="0" w:lastColumn="0" w:oddVBand="0" w:evenVBand="0" w:oddHBand="1" w:evenHBand="0" w:firstRowFirstColumn="0" w:firstRowLastColumn="0" w:lastRowFirstColumn="0" w:lastRowLastColumn="0"/>
-            </w:pPr>
-            <w:r>
-              <w:t>Safe</w:t>
-            </w:r>
-          </w:p>
-        </w:tc>
-        <w:tc>
-          <w:tcPr>
-            <w:tcW w:w="5789" w:type="dxa"/>
-            <w:hideMark/>
-          </w:tcPr>
-          <w:p>
-            <w:pPr>
-              <w:spacing w:before="240" w:line="360" w:lineRule="auto"/>
-              <w:jc w:val="center"/>
-              <w:cnfStyle w:val="000000100000" w:firstRow="0" w:lastRow="0" w:firstColumn="0" w:lastColumn="0" w:oddVBand="0" w:evenVBand="0" w:oddHBand="1" w:evenHBand="0" w:firstRowFirstColumn="0" w:firstRowLastColumn="0" w:lastRowFirstColumn="0" w:lastRowLastColumn="0"/>
-            </w:pPr>
-            <w:r>
-              <w:t>Connect to Motor Driver Enable pin.</w:t>
-            </w:r>
-          </w:p>
-        </w:tc>
-      </w:tr>
-      <w:tr>
-        <w:trPr>
-          <w:trHeight w:val="813"/>
-          <w:jc w:val="center"/>
-        </w:trPr>
-        <w:tc>
-          <w:tcPr>
-            <w:cnfStyle w:val="001000000000" w:firstRow="0" w:lastRow="0" w:firstColumn="1" w:lastColumn="0" w:oddVBand="0" w:evenVBand="0" w:oddHBand="0" w:evenHBand="0" w:firstRowFirstColumn="0" w:firstRowLastColumn="0" w:lastRowFirstColumn="0" w:lastRowLastColumn="0"/>
-            <w:tcW w:w="0" w:type="auto"/>
-            <w:hideMark/>
-          </w:tcPr>
-          <w:p>
-            <w:pPr>
-              <w:spacing w:before="240" w:line="360" w:lineRule="auto"/>
-              <w:jc w:val="center"/>
-            </w:pPr>
-            <w:r>
-              <w:t>DC Motor 1</w:t>
-            </w:r>
-          </w:p>
-        </w:tc>
-        <w:tc>
-          <w:tcPr>
-            <w:tcW w:w="0" w:type="auto"/>
-            <w:hideMark/>
-          </w:tcPr>
-          <w:p>
-            <w:pPr>
-              <w:spacing w:before="240" w:line="360" w:lineRule="auto"/>
-              <w:jc w:val="center"/>
-              <w:cnfStyle w:val="000000000000" w:firstRow="0" w:lastRow="0" w:firstColumn="0" w:lastColumn="0" w:oddVBand="0" w:evenVBand="0" w:oddHBand="0" w:evenHBand="0" w:firstRowFirstColumn="0" w:firstRowLastColumn="0" w:lastRowFirstColumn="0" w:lastRowLastColumn="0"/>
-            </w:pPr>
-            <w:r>
-              <w:t>Direction (DIR)</w:t>
-            </w:r>
-          </w:p>
-        </w:tc>
-        <w:tc>
-          <w:tcPr>
-            <w:tcW w:w="0" w:type="auto"/>
-            <w:hideMark/>
-          </w:tcPr>
-          <w:p>
-            <w:pPr>
-              <w:spacing w:before="240" w:line="360" w:lineRule="auto"/>
-              <w:jc w:val="center"/>
-              <w:cnfStyle w:val="000000000000" w:firstRow="0" w:lastRow="0" w:firstColumn="0" w:lastColumn="0" w:oddVBand="0" w:evenVBand="0" w:oddHBand="0" w:evenHBand="0" w:firstRowFirstColumn="0" w:firstRowLastColumn="0" w:lastRowFirstColumn="0" w:lastRowLastColumn="0"/>
-            </w:pPr>
-            <w:r>
-              <w:t>GPIO 19</w:t>
-            </w:r>
-          </w:p>
-        </w:tc>
-        <w:tc>
-          <w:tcPr>
-            <w:tcW w:w="0" w:type="auto"/>
-            <w:hideMark/>
-          </w:tcPr>
-          <w:p>
-            <w:pPr>
-              <w:spacing w:before="240" w:line="360" w:lineRule="auto"/>
-              <w:jc w:val="center"/>
-              <w:cnfStyle w:val="000000000000" w:firstRow="0" w:lastRow="0" w:firstColumn="0" w:lastColumn="0" w:oddVBand="0" w:evenVBand="0" w:oddHBand="0" w:evenHBand="0" w:firstRowFirstColumn="0" w:firstRowLastColumn="0" w:lastRowFirstColumn="0" w:lastRowLastColumn="0"/>
-            </w:pPr>
-            <w:r>
-              <w:t>Safe</w:t>
-            </w:r>
-          </w:p>
-        </w:tc>
-        <w:tc>
-          <w:tcPr>
-            <w:tcW w:w="5789" w:type="dxa"/>
-            <w:hideMark/>
-          </w:tcPr>
-          <w:p>
-            <w:pPr>
-              <w:spacing w:before="240" w:line="360" w:lineRule="auto"/>
-              <w:jc w:val="center"/>
-              <w:cnfStyle w:val="000000000000" w:firstRow="0" w:lastRow="0" w:firstColumn="0" w:lastColumn="0" w:oddVBand="0" w:evenVBand="0" w:oddHBand="0" w:evenHBand="0" w:firstRowFirstColumn="0" w:firstRowLastColumn="0" w:lastRowFirstColumn="0" w:lastRowLastColumn="0"/>
-            </w:pPr>
-            <w:r>
-              <w:t>Connect to IN1 (and NOT gate to IN2).</w:t>
-            </w:r>
-          </w:p>
-        </w:tc>
-      </w:tr>
-      <w:tr>
-        <w:trPr>
-          <w:cnfStyle w:val="000000100000" w:firstRow="0" w:lastRow="0" w:firstColumn="0" w:lastColumn="0" w:oddVBand="0" w:evenVBand="0" w:oddHBand="1" w:evenHBand="0" w:firstRowFirstColumn="0" w:firstRowLastColumn="0" w:lastRowFirstColumn="0" w:lastRowLastColumn="0"/>
-          <w:trHeight w:val="787"/>
-          <w:jc w:val="center"/>
-        </w:trPr>
-        <w:tc>
-          <w:tcPr>
-            <w:cnfStyle w:val="001000000000" w:firstRow="0" w:lastRow="0" w:firstColumn="1" w:lastColumn="0" w:oddVBand="0" w:evenVBand="0" w:oddHBand="0" w:evenHBand="0" w:firstRowFirstColumn="0" w:firstRowLastColumn="0" w:lastRowFirstColumn="0" w:lastRowLastColumn="0"/>
-            <w:tcW w:w="0" w:type="auto"/>
-            <w:hideMark/>
-          </w:tcPr>
-          <w:p>
-            <w:pPr>
-              <w:spacing w:before="240" w:line="360" w:lineRule="auto"/>
-              <w:jc w:val="center"/>
-            </w:pPr>
-            <w:r>
-              <w:t>DC Motor 2</w:t>
-            </w:r>
-          </w:p>
-        </w:tc>
-        <w:tc>
-          <w:tcPr>
-            <w:tcW w:w="0" w:type="auto"/>
-            <w:hideMark/>
-          </w:tcPr>
-          <w:p>
-            <w:pPr>
-              <w:spacing w:before="240" w:line="360" w:lineRule="auto"/>
-              <w:jc w:val="center"/>
-              <w:cnfStyle w:val="000000100000" w:firstRow="0" w:lastRow="0" w:firstColumn="0" w:lastColumn="0" w:oddVBand="0" w:evenVBand="0" w:oddHBand="1" w:evenHBand="0" w:firstRowFirstColumn="0" w:firstRowLastColumn="0" w:lastRowFirstColumn="0" w:lastRowLastColumn="0"/>
-            </w:pPr>
-            <w:r>
-              <w:t>Speed (PWM)</w:t>
-            </w:r>
-          </w:p>
-        </w:tc>
-        <w:tc>
-          <w:tcPr>
-            <w:tcW w:w="0" w:type="auto"/>
-            <w:hideMark/>
-          </w:tcPr>
-          <w:p>
-            <w:pPr>
-              <w:spacing w:before="240" w:line="360" w:lineRule="auto"/>
-              <w:jc w:val="center"/>
-              <w:cnfStyle w:val="000000100000" w:firstRow="0" w:lastRow="0" w:firstColumn="0" w:lastColumn="0" w:oddVBand="0" w:evenVBand="0" w:oddHBand="1" w:evenHBand="0" w:firstRowFirstColumn="0" w:firstRowLastColumn="0" w:lastRowFirstColumn="0" w:lastRowLastColumn="0"/>
-            </w:pPr>
-            <w:r>
-              <w:t>GPIO 4</w:t>
-            </w:r>
-          </w:p>
-        </w:tc>
-        <w:tc>
-          <w:tcPr>
-            <w:tcW w:w="0" w:type="auto"/>
-            <w:hideMark/>
-          </w:tcPr>
-          <w:p>
-            <w:pPr>
-              <w:spacing w:before="240" w:line="360" w:lineRule="auto"/>
-              <w:jc w:val="center"/>
-              <w:cnfStyle w:val="000000100000" w:firstRow="0" w:lastRow="0" w:firstColumn="0" w:lastColumn="0" w:oddVBand="0" w:evenVBand="0" w:oddHBand="1" w:evenHBand="0" w:firstRowFirstColumn="0" w:firstRowLastColumn="0" w:lastRowFirstColumn="0" w:lastRowLastColumn="0"/>
-            </w:pPr>
-            <w:r>
-              <w:t>Safe</w:t>
-            </w:r>
-          </w:p>
-        </w:tc>
-        <w:tc>
-          <w:tcPr>
-            <w:tcW w:w="5789" w:type="dxa"/>
-            <w:hideMark/>
-          </w:tcPr>
-          <w:p>
-            <w:pPr>
-              <w:spacing w:before="240" w:line="360" w:lineRule="auto"/>
-              <w:jc w:val="center"/>
-              <w:cnfStyle w:val="000000100000" w:firstRow="0" w:lastRow="0" w:firstColumn="0" w:lastColumn="0" w:oddVBand="0" w:evenVBand="0" w:oddHBand="1" w:evenHBand="0" w:firstRowFirstColumn="0" w:firstRowLastColumn="0" w:lastRowFirstColumn="0" w:lastRowLastColumn="0"/>
-            </w:pPr>
-            <w:r>
-              <w:t>Connect to Motor Driver Enable pin.</w:t>
+              <w:t>Must add a 10kΩ Pull-Up resistor to 3.3V.</w:t>
             </w:r>
           </w:p>
         </w:tc>
@@ -1340,7 +1538,7 @@
               <w:jc w:val="center"/>
             </w:pPr>
             <w:r>
-              <w:t>DC Motor 2</w:t>
+              <w:t>DC Motor 4</w:t>
             </w:r>
           </w:p>
         </w:tc>
@@ -1356,7 +1554,7 @@
               <w:cnfStyle w:val="000000000000" w:firstRow="0" w:lastRow="0" w:firstColumn="0" w:lastColumn="0" w:oddVBand="0" w:evenVBand="0" w:oddHBand="0" w:evenHBand="0" w:firstRowFirstColumn="0" w:firstRowLastColumn="0" w:lastRowFirstColumn="0" w:lastRowLastColumn="0"/>
             </w:pPr>
             <w:r>
-              <w:t>Direction (DIR)</w:t>
+              <w:t>Speed (PWM)</w:t>
             </w:r>
           </w:p>
         </w:tc>
@@ -1372,7 +1570,7 @@
               <w:cnfStyle w:val="000000000000" w:firstRow="0" w:lastRow="0" w:firstColumn="0" w:lastColumn="0" w:oddVBand="0" w:evenVBand="0" w:oddHBand="0" w:evenHBand="0" w:firstRowFirstColumn="0" w:firstRowLastColumn="0" w:lastRowFirstColumn="0" w:lastRowLastColumn="0"/>
             </w:pPr>
             <w:r>
-              <w:t>GPIO 23</w:t>
+              <w:t>GPIO 17</w:t>
             </w:r>
           </w:p>
         </w:tc>
@@ -1404,7 +1602,7 @@
               <w:cnfStyle w:val="000000000000" w:firstRow="0" w:lastRow="0" w:firstColumn="0" w:lastColumn="0" w:oddVBand="0" w:evenVBand="0" w:oddHBand="0" w:evenHBand="0" w:firstRowFirstColumn="0" w:firstRowLastColumn="0" w:lastRowFirstColumn="0" w:lastRowLastColumn="0"/>
             </w:pPr>
             <w:r>
-              <w:t>Connect to IN1 (and NOT gate to IN2).</w:t>
+              <w:t>Connect to Motor Driver Enable pin.</w:t>
             </w:r>
           </w:p>
         </w:tc>
@@ -1412,92 +1610,6 @@
       <w:tr>
         <w:trPr>
           <w:cnfStyle w:val="000000100000" w:firstRow="0" w:lastRow="0" w:firstColumn="0" w:lastColumn="0" w:oddVBand="0" w:evenVBand="0" w:oddHBand="1" w:evenHBand="0" w:firstRowFirstColumn="0" w:firstRowLastColumn="0" w:lastRowFirstColumn="0" w:lastRowLastColumn="0"/>
-          <w:trHeight w:val="813"/>
-          <w:jc w:val="center"/>
-        </w:trPr>
-        <w:tc>
-          <w:tcPr>
-            <w:cnfStyle w:val="001000000000" w:firstRow="0" w:lastRow="0" w:firstColumn="1" w:lastColumn="0" w:oddVBand="0" w:evenVBand="0" w:oddHBand="0" w:evenHBand="0" w:firstRowFirstColumn="0" w:firstRowLastColumn="0" w:lastRowFirstColumn="0" w:lastRowLastColumn="0"/>
-            <w:tcW w:w="0" w:type="auto"/>
-            <w:hideMark/>
-          </w:tcPr>
-          <w:p>
-            <w:pPr>
-              <w:spacing w:before="240" w:line="360" w:lineRule="auto"/>
-              <w:jc w:val="center"/>
-            </w:pPr>
-            <w:r>
-              <w:t>DC Motor 3</w:t>
-            </w:r>
-          </w:p>
-        </w:tc>
-        <w:tc>
-          <w:tcPr>
-            <w:tcW w:w="0" w:type="auto"/>
-            <w:hideMark/>
-          </w:tcPr>
-          <w:p>
-            <w:pPr>
-              <w:spacing w:before="240" w:line="360" w:lineRule="auto"/>
-              <w:jc w:val="center"/>
-              <w:cnfStyle w:val="000000100000" w:firstRow="0" w:lastRow="0" w:firstColumn="0" w:lastColumn="0" w:oddVBand="0" w:evenVBand="0" w:oddHBand="1" w:evenHBand="0" w:firstRowFirstColumn="0" w:firstRowLastColumn="0" w:lastRowFirstColumn="0" w:lastRowLastColumn="0"/>
-            </w:pPr>
-            <w:r>
-              <w:t>Speed (PWM)</w:t>
-            </w:r>
-          </w:p>
-        </w:tc>
-        <w:tc>
-          <w:tcPr>
-            <w:tcW w:w="0" w:type="auto"/>
-            <w:hideMark/>
-          </w:tcPr>
-          <w:p>
-            <w:pPr>
-              <w:spacing w:before="240" w:line="360" w:lineRule="auto"/>
-              <w:jc w:val="center"/>
-              <w:cnfStyle w:val="000000100000" w:firstRow="0" w:lastRow="0" w:firstColumn="0" w:lastColumn="0" w:oddVBand="0" w:evenVBand="0" w:oddHBand="1" w:evenHBand="0" w:firstRowFirstColumn="0" w:firstRowLastColumn="0" w:lastRowFirstColumn="0" w:lastRowLastColumn="0"/>
-            </w:pPr>
-            <w:r>
-              <w:t>GPIO 16</w:t>
-            </w:r>
-          </w:p>
-        </w:tc>
-        <w:tc>
-          <w:tcPr>
-            <w:tcW w:w="0" w:type="auto"/>
-            <w:hideMark/>
-          </w:tcPr>
-          <w:p>
-            <w:pPr>
-              <w:spacing w:before="240" w:line="360" w:lineRule="auto"/>
-              <w:jc w:val="center"/>
-              <w:cnfStyle w:val="000000100000" w:firstRow="0" w:lastRow="0" w:firstColumn="0" w:lastColumn="0" w:oddVBand="0" w:evenVBand="0" w:oddHBand="1" w:evenHBand="0" w:firstRowFirstColumn="0" w:firstRowLastColumn="0" w:lastRowFirstColumn="0" w:lastRowLastColumn="0"/>
-            </w:pPr>
-            <w:r>
-              <w:t>Safe</w:t>
-            </w:r>
-          </w:p>
-        </w:tc>
-        <w:tc>
-          <w:tcPr>
-            <w:tcW w:w="5789" w:type="dxa"/>
-            <w:hideMark/>
-          </w:tcPr>
-          <w:p>
-            <w:pPr>
-              <w:spacing w:before="240" w:line="360" w:lineRule="auto"/>
-              <w:jc w:val="center"/>
-              <w:cnfStyle w:val="000000100000" w:firstRow="0" w:lastRow="0" w:firstColumn="0" w:lastColumn="0" w:oddVBand="0" w:evenVBand="0" w:oddHBand="1" w:evenHBand="0" w:firstRowFirstColumn="0" w:firstRowLastColumn="0" w:lastRowFirstColumn="0" w:lastRowLastColumn="0"/>
-            </w:pPr>
-            <w:r>
-              <w:t>Connect to Motor Driver Enable pin.</w:t>
-            </w:r>
-          </w:p>
-        </w:tc>
-      </w:tr>
-      <w:tr>
-        <w:trPr>
           <w:trHeight w:val="868"/>
           <w:jc w:val="center"/>
         </w:trPr>
@@ -1513,20 +1625,20 @@
               <w:jc w:val="center"/>
             </w:pPr>
             <w:r>
-              <w:t>DC Motor 3</w:t>
-            </w:r>
-          </w:p>
-        </w:tc>
-        <w:tc>
-          <w:tcPr>
-            <w:tcW w:w="0" w:type="auto"/>
-            <w:hideMark/>
-          </w:tcPr>
-          <w:p>
-            <w:pPr>
-              <w:spacing w:before="240" w:line="360" w:lineRule="auto"/>
-              <w:jc w:val="center"/>
-              <w:cnfStyle w:val="000000000000" w:firstRow="0" w:lastRow="0" w:firstColumn="0" w:lastColumn="0" w:oddVBand="0" w:evenVBand="0" w:oddHBand="0" w:evenHBand="0" w:firstRowFirstColumn="0" w:firstRowLastColumn="0" w:lastRowFirstColumn="0" w:lastRowLastColumn="0"/>
+              <w:t>DC Motor 4</w:t>
+            </w:r>
+          </w:p>
+        </w:tc>
+        <w:tc>
+          <w:tcPr>
+            <w:tcW w:w="0" w:type="auto"/>
+            <w:hideMark/>
+          </w:tcPr>
+          <w:p>
+            <w:pPr>
+              <w:spacing w:before="240" w:line="360" w:lineRule="auto"/>
+              <w:jc w:val="center"/>
+              <w:cnfStyle w:val="000000100000" w:firstRow="0" w:lastRow="0" w:firstColumn="0" w:lastColumn="0" w:oddVBand="0" w:evenVBand="0" w:oddHBand="1" w:evenHBand="0" w:firstRowFirstColumn="0" w:firstRowLastColumn="0" w:lastRowFirstColumn="0" w:lastRowLastColumn="0"/>
             </w:pPr>
             <w:r>
               <w:t>Direction (DIR)</w:t>
@@ -1542,27 +1654,27 @@
             <w:pPr>
               <w:spacing w:before="240" w:line="360" w:lineRule="auto"/>
               <w:jc w:val="center"/>
-              <w:cnfStyle w:val="000000000000" w:firstRow="0" w:lastRow="0" w:firstColumn="0" w:lastColumn="0" w:oddVBand="0" w:evenVBand="0" w:oddHBand="0" w:evenHBand="0" w:firstRowFirstColumn="0" w:firstRowLastColumn="0" w:lastRowFirstColumn="0" w:lastRowLastColumn="0"/>
+              <w:cnfStyle w:val="000000100000" w:firstRow="0" w:lastRow="0" w:firstColumn="0" w:lastColumn="0" w:oddVBand="0" w:evenVBand="0" w:oddHBand="1" w:evenHBand="0" w:firstRowFirstColumn="0" w:firstRowLastColumn="0" w:lastRowFirstColumn="0" w:lastRowLastColumn="0"/>
             </w:pPr>
             <w:r>
               <w:rPr>
                 <w:b/>
                 <w:bCs/>
               </w:rPr>
-              <w:t>GPIO 5</w:t>
-            </w:r>
-          </w:p>
-        </w:tc>
-        <w:tc>
-          <w:tcPr>
-            <w:tcW w:w="0" w:type="auto"/>
-            <w:hideMark/>
-          </w:tcPr>
-          <w:p>
-            <w:pPr>
-              <w:spacing w:before="240" w:line="360" w:lineRule="auto"/>
-              <w:jc w:val="center"/>
-              <w:cnfStyle w:val="000000000000" w:firstRow="0" w:lastRow="0" w:firstColumn="0" w:lastColumn="0" w:oddVBand="0" w:evenVBand="0" w:oddHBand="0" w:evenHBand="0" w:firstRowFirstColumn="0" w:firstRowLastColumn="0" w:lastRowFirstColumn="0" w:lastRowLastColumn="0"/>
+              <w:t>GPIO 15</w:t>
+            </w:r>
+          </w:p>
+        </w:tc>
+        <w:tc>
+          <w:tcPr>
+            <w:tcW w:w="0" w:type="auto"/>
+            <w:hideMark/>
+          </w:tcPr>
+          <w:p>
+            <w:pPr>
+              <w:spacing w:before="240" w:line="360" w:lineRule="auto"/>
+              <w:jc w:val="center"/>
+              <w:cnfStyle w:val="000000100000" w:firstRow="0" w:lastRow="0" w:firstColumn="0" w:lastColumn="0" w:oddVBand="0" w:evenVBand="0" w:oddHBand="1" w:evenHBand="0" w:firstRowFirstColumn="0" w:firstRowLastColumn="0" w:lastRowFirstColumn="0" w:lastRowLastColumn="0"/>
             </w:pPr>
             <w:r>
               <w:rPr>
@@ -1582,201 +1694,7 @@
             <w:pPr>
               <w:spacing w:before="240" w:line="360" w:lineRule="auto"/>
               <w:jc w:val="center"/>
-              <w:cnfStyle w:val="000000000000" w:firstRow="0" w:lastRow="0" w:firstColumn="0" w:lastColumn="0" w:oddVBand="0" w:evenVBand="0" w:oddHBand="0" w:evenHBand="0" w:firstRowFirstColumn="0" w:firstRowLastColumn="0" w:lastRowFirstColumn="0" w:lastRowLastColumn="0"/>
-            </w:pPr>
-            <w:r>
-              <w:rPr>
-                <w:rFonts w:ascii="Segoe UI Emoji" w:hAnsi="Segoe UI Emoji" w:cs="Segoe UI Emoji"/>
-              </w:rPr>
-              <w:t>⚠️</w:t>
-            </w:r>
-            <w:r>
-              <w:t xml:space="preserve"> </w:t>
-            </w:r>
-            <w:r>
-              <w:rPr>
-                <w:b/>
-                <w:bCs/>
-              </w:rPr>
-              <w:t>Must add a 10kΩ Pull-Up resistor to 3.3V.</w:t>
-            </w:r>
-          </w:p>
-        </w:tc>
-      </w:tr>
-      <w:tr>
-        <w:trPr>
-          <w:cnfStyle w:val="000000100000" w:firstRow="0" w:lastRow="0" w:firstColumn="0" w:lastColumn="0" w:oddVBand="0" w:evenVBand="0" w:oddHBand="1" w:evenHBand="0" w:firstRowFirstColumn="0" w:firstRowLastColumn="0" w:lastRowFirstColumn="0" w:lastRowLastColumn="0"/>
-          <w:trHeight w:val="787"/>
-          <w:jc w:val="center"/>
-        </w:trPr>
-        <w:tc>
-          <w:tcPr>
-            <w:cnfStyle w:val="001000000000" w:firstRow="0" w:lastRow="0" w:firstColumn="1" w:lastColumn="0" w:oddVBand="0" w:evenVBand="0" w:oddHBand="0" w:evenHBand="0" w:firstRowFirstColumn="0" w:firstRowLastColumn="0" w:lastRowFirstColumn="0" w:lastRowLastColumn="0"/>
-            <w:tcW w:w="0" w:type="auto"/>
-            <w:hideMark/>
-          </w:tcPr>
-          <w:p>
-            <w:pPr>
-              <w:spacing w:before="240" w:line="360" w:lineRule="auto"/>
-              <w:jc w:val="center"/>
-            </w:pPr>
-            <w:r>
-              <w:t>DC Motor 4</w:t>
-            </w:r>
-          </w:p>
-        </w:tc>
-        <w:tc>
-          <w:tcPr>
-            <w:tcW w:w="0" w:type="auto"/>
-            <w:hideMark/>
-          </w:tcPr>
-          <w:p>
-            <w:pPr>
-              <w:spacing w:before="240" w:line="360" w:lineRule="auto"/>
-              <w:jc w:val="center"/>
-              <w:cnfStyle w:val="000000100000" w:firstRow="0" w:lastRow="0" w:firstColumn="0" w:lastColumn="0" w:oddVBand="0" w:evenVBand="0" w:oddHBand="1" w:evenHBand="0" w:firstRowFirstColumn="0" w:firstRowLastColumn="0" w:lastRowFirstColumn="0" w:lastRowLastColumn="0"/>
-            </w:pPr>
-            <w:r>
-              <w:t>Speed (PWM)</w:t>
-            </w:r>
-          </w:p>
-        </w:tc>
-        <w:tc>
-          <w:tcPr>
-            <w:tcW w:w="0" w:type="auto"/>
-            <w:hideMark/>
-          </w:tcPr>
-          <w:p>
-            <w:pPr>
-              <w:spacing w:before="240" w:line="360" w:lineRule="auto"/>
-              <w:jc w:val="center"/>
-              <w:cnfStyle w:val="000000100000" w:firstRow="0" w:lastRow="0" w:firstColumn="0" w:lastColumn="0" w:oddVBand="0" w:evenVBand="0" w:oddHBand="1" w:evenHBand="0" w:firstRowFirstColumn="0" w:firstRowLastColumn="0" w:lastRowFirstColumn="0" w:lastRowLastColumn="0"/>
-            </w:pPr>
-            <w:r>
-              <w:t>GPIO 17</w:t>
-            </w:r>
-          </w:p>
-        </w:tc>
-        <w:tc>
-          <w:tcPr>
-            <w:tcW w:w="0" w:type="auto"/>
-            <w:hideMark/>
-          </w:tcPr>
-          <w:p>
-            <w:pPr>
-              <w:spacing w:before="240" w:line="360" w:lineRule="auto"/>
-              <w:jc w:val="center"/>
-              <w:cnfStyle w:val="000000100000" w:firstRow="0" w:lastRow="0" w:firstColumn="0" w:lastColumn="0" w:oddVBand="0" w:evenVBand="0" w:oddHBand="1" w:evenHBand="0" w:firstRowFirstColumn="0" w:firstRowLastColumn="0" w:lastRowFirstColumn="0" w:lastRowLastColumn="0"/>
-            </w:pPr>
-            <w:r>
-              <w:t>Safe</w:t>
-            </w:r>
-          </w:p>
-        </w:tc>
-        <w:tc>
-          <w:tcPr>
-            <w:tcW w:w="5789" w:type="dxa"/>
-            <w:hideMark/>
-          </w:tcPr>
-          <w:p>
-            <w:pPr>
-              <w:spacing w:before="240" w:line="360" w:lineRule="auto"/>
-              <w:jc w:val="center"/>
-              <w:cnfStyle w:val="000000100000" w:firstRow="0" w:lastRow="0" w:firstColumn="0" w:lastColumn="0" w:oddVBand="0" w:evenVBand="0" w:oddHBand="1" w:evenHBand="0" w:firstRowFirstColumn="0" w:firstRowLastColumn="0" w:lastRowFirstColumn="0" w:lastRowLastColumn="0"/>
-            </w:pPr>
-            <w:r>
-              <w:t>Connect to Motor Driver Enable pin.</w:t>
-            </w:r>
-          </w:p>
-        </w:tc>
-      </w:tr>
-      <w:tr>
-        <w:trPr>
-          <w:trHeight w:val="868"/>
-          <w:jc w:val="center"/>
-        </w:trPr>
-        <w:tc>
-          <w:tcPr>
-            <w:cnfStyle w:val="001000000000" w:firstRow="0" w:lastRow="0" w:firstColumn="1" w:lastColumn="0" w:oddVBand="0" w:evenVBand="0" w:oddHBand="0" w:evenHBand="0" w:firstRowFirstColumn="0" w:firstRowLastColumn="0" w:lastRowFirstColumn="0" w:lastRowLastColumn="0"/>
-            <w:tcW w:w="0" w:type="auto"/>
-            <w:hideMark/>
-          </w:tcPr>
-          <w:p>
-            <w:pPr>
-              <w:spacing w:before="240" w:line="360" w:lineRule="auto"/>
-              <w:jc w:val="center"/>
-            </w:pPr>
-            <w:r>
-              <w:t>DC Motor 4</w:t>
-            </w:r>
-          </w:p>
-        </w:tc>
-        <w:tc>
-          <w:tcPr>
-            <w:tcW w:w="0" w:type="auto"/>
-            <w:hideMark/>
-          </w:tcPr>
-          <w:p>
-            <w:pPr>
-              <w:spacing w:before="240" w:line="360" w:lineRule="auto"/>
-              <w:jc w:val="center"/>
-              <w:cnfStyle w:val="000000000000" w:firstRow="0" w:lastRow="0" w:firstColumn="0" w:lastColumn="0" w:oddVBand="0" w:evenVBand="0" w:oddHBand="0" w:evenHBand="0" w:firstRowFirstColumn="0" w:firstRowLastColumn="0" w:lastRowFirstColumn="0" w:lastRowLastColumn="0"/>
-            </w:pPr>
-            <w:r>
-              <w:t>Direction (DIR)</w:t>
-            </w:r>
-          </w:p>
-        </w:tc>
-        <w:tc>
-          <w:tcPr>
-            <w:tcW w:w="0" w:type="auto"/>
-            <w:hideMark/>
-          </w:tcPr>
-          <w:p>
-            <w:pPr>
-              <w:spacing w:before="240" w:line="360" w:lineRule="auto"/>
-              <w:jc w:val="center"/>
-              <w:cnfStyle w:val="000000000000" w:firstRow="0" w:lastRow="0" w:firstColumn="0" w:lastColumn="0" w:oddVBand="0" w:evenVBand="0" w:oddHBand="0" w:evenHBand="0" w:firstRowFirstColumn="0" w:firstRowLastColumn="0" w:lastRowFirstColumn="0" w:lastRowLastColumn="0"/>
-            </w:pPr>
-            <w:r>
-              <w:rPr>
-                <w:b/>
-                <w:bCs/>
-              </w:rPr>
-              <w:t>GPIO 15</w:t>
-            </w:r>
-          </w:p>
-        </w:tc>
-        <w:tc>
-          <w:tcPr>
-            <w:tcW w:w="0" w:type="auto"/>
-            <w:hideMark/>
-          </w:tcPr>
-          <w:p>
-            <w:pPr>
-              <w:spacing w:before="240" w:line="360" w:lineRule="auto"/>
-              <w:jc w:val="center"/>
-              <w:cnfStyle w:val="000000000000" w:firstRow="0" w:lastRow="0" w:firstColumn="0" w:lastColumn="0" w:oddVBand="0" w:evenVBand="0" w:oddHBand="0" w:evenHBand="0" w:firstRowFirstColumn="0" w:firstRowLastColumn="0" w:lastRowFirstColumn="0" w:lastRowLastColumn="0"/>
-            </w:pPr>
-            <w:r>
-              <w:rPr>
-                <w:b/>
-                <w:bCs/>
-              </w:rPr>
-              <w:t>Strapping</w:t>
-            </w:r>
-          </w:p>
-        </w:tc>
-        <w:tc>
-          <w:tcPr>
-            <w:tcW w:w="5789" w:type="dxa"/>
-            <w:hideMark/>
-          </w:tcPr>
-          <w:p>
-            <w:pPr>
-              <w:spacing w:before="240" w:line="360" w:lineRule="auto"/>
-              <w:jc w:val="center"/>
-              <w:cnfStyle w:val="000000000000" w:firstRow="0" w:lastRow="0" w:firstColumn="0" w:lastColumn="0" w:oddVBand="0" w:evenVBand="0" w:oddHBand="0" w:evenHBand="0" w:firstRowFirstColumn="0" w:firstRowLastColumn="0" w:lastRowFirstColumn="0" w:lastRowLastColumn="0"/>
+              <w:cnfStyle w:val="000000100000" w:firstRow="0" w:lastRow="0" w:firstColumn="0" w:lastColumn="0" w:oddVBand="0" w:evenVBand="0" w:oddHBand="1" w:evenHBand="0" w:firstRowFirstColumn="0" w:firstRowLastColumn="0" w:lastRowFirstColumn="0" w:lastRowLastColumn="0"/>
             </w:pPr>
             <w:r>
               <w:rPr>

</xml_diff>